<commit_message>
feat(papers): sync latest Chinese and English paper suites, formal proofs, and monographs from 系统科学
</commit_message>
<xml_diff>
--- a/docs/Formal_Proof_Living_Expression_OCGS_JSSC.docx
+++ b/docs/Formal_Proof_Living_Expression_OCGS_JSSC.docx
@@ -29,31 +29,7 @@
           <w:b/>
           <w:bCs/>
         </w:rPr>
-        <w:t xml:space="preserve">Grit Meng </w:t>
-      </w:r>
-      <w:r>
-        <w:rPr>
-          <w:rFonts w:hint="eastAsia"/>
-          <w:b/>
-          <w:bCs/>
-        </w:rPr>
-        <w:t>(</w:t>
-      </w:r>
-      <w:r>
-        <w:rPr>
-          <w:rFonts w:hint="eastAsia"/>
-          <w:b/>
-          <w:bCs/>
-        </w:rPr>
-        <w:t>孟凡淳</w:t>
-      </w:r>
-      <w:r>
-        <w:rPr>
-          <w:rFonts w:hint="eastAsia"/>
-          <w:b/>
-          <w:bCs/>
-        </w:rPr>
-        <w:t>)</w:t>
+        <w:t>Grit Meng</w:t>
       </w:r>
       <w:r>
         <w:br/>
@@ -66,7 +42,7 @@
     </w:p>
     <w:p>
       <w:r>
-        <w:pict w14:anchorId="2485F19A">
+        <w:pict>
           <v:rect id="_x0000_i1025" style="width:0;height:1.5pt" o:hralign="center" o:hrstd="t" o:hr="t"/>
         </w:pict>
       </w:r>
@@ -237,7 +213,7 @@
     </w:p>
     <w:p>
       <w:r>
-        <w:pict w14:anchorId="41925ACA">
+        <w:pict>
           <v:rect id="_x0000_i1026" style="width:0;height:1.5pt" o:hralign="center" o:hrstd="t" o:hr="t"/>
         </w:pict>
       </w:r>
@@ -278,24 +254,15 @@
             </m:ctrlPr>
           </m:sSubPr>
           <m:e>
-            <m:acc>
-              <m:accPr>
-                <m:chr m:val="⃗"/>
-                <m:ctrlPr>
-                  <w:rPr>
-                    <w:rFonts w:ascii="Cambria Math" w:hAnsi="Cambria Math"/>
-                  </w:rPr>
-                </m:ctrlPr>
-              </m:accPr>
-              <m:e>
-                <m:r>
-                  <w:rPr>
-                    <w:rFonts w:ascii="Cambria Math" w:hAnsi="Cambria Math"/>
-                  </w:rPr>
-                  <m:t>v</m:t>
-                </m:r>
-              </m:e>
-            </m:acc>
+            <m:r>
+              <m:rPr>
+                <m:sty m:val="bi"/>
+              </m:rPr>
+              <w:rPr>
+                <w:rFonts w:ascii="Cambria Math" w:hAnsi="Cambria Math"/>
+              </w:rPr>
+              <m:t>v</m:t>
+            </m:r>
           </m:e>
           <m:sub>
             <m:r>
@@ -324,24 +291,15 @@
             </m:ctrlPr>
           </m:sSubPr>
           <m:e>
-            <m:acc>
-              <m:accPr>
-                <m:chr m:val="⃗"/>
-                <m:ctrlPr>
-                  <w:rPr>
-                    <w:rFonts w:ascii="Cambria Math" w:hAnsi="Cambria Math"/>
-                  </w:rPr>
-                </m:ctrlPr>
-              </m:accPr>
-              <m:e>
-                <m:r>
-                  <w:rPr>
-                    <w:rFonts w:ascii="Cambria Math" w:hAnsi="Cambria Math"/>
-                  </w:rPr>
-                  <m:t>v</m:t>
-                </m:r>
-              </m:e>
-            </m:acc>
+            <m:r>
+              <m:rPr>
+                <m:sty m:val="bi"/>
+              </m:rPr>
+              <w:rPr>
+                <w:rFonts w:ascii="Cambria Math" w:hAnsi="Cambria Math"/>
+              </w:rPr>
+              <m:t>v</m:t>
+            </m:r>
           </m:e>
           <m:sub>
             <m:r>
@@ -366,21 +324,254 @@
           <m:jc m:val="center"/>
         </m:oMathParaPr>
         <m:oMath>
-          <m:r>
-            <m:rPr>
-              <m:nor/>
-            </m:rPr>
-            <m:t>Physical Reality (Strongly Coupled)</m:t>
-          </m:r>
-          <m:limUpp>
-            <m:limUppPr>
+          <m:eqArr>
+            <m:eqArrPr>
               <m:ctrlPr>
                 <w:rPr>
                   <w:rFonts w:ascii="Cambria Math" w:hAnsi="Cambria Math"/>
                 </w:rPr>
               </m:ctrlPr>
-            </m:limUppPr>
+            </m:eqArrPr>
             <m:e>
+              <m:r>
+                <m:rPr>
+                  <m:nor/>
+                </m:rPr>
+                <m:t>Physical Reality (Strongly Coupled)</m:t>
+              </m:r>
+              <m:r>
+                <w:rPr>
+                  <w:rFonts w:ascii="Cambria Math" w:hAnsi="Cambria Math"/>
+                </w:rPr>
+                <m:t>&amp;</m:t>
+              </m:r>
+              <m:limUpp>
+                <m:limUppPr>
+                  <m:ctrlPr>
+                    <w:rPr>
+                      <w:rFonts w:ascii="Cambria Math" w:hAnsi="Cambria Math"/>
+                    </w:rPr>
+                  </m:ctrlPr>
+                </m:limUppPr>
+                <m:e>
+                  <m:r>
+                    <m:rPr>
+                      <m:sty m:val="p"/>
+                    </m:rPr>
+                    <w:rPr>
+                      <w:rFonts w:ascii="Cambria Math" w:hAnsi="Cambria Math"/>
+                    </w:rPr>
+                    <m:t>→</m:t>
+                  </m:r>
+                </m:e>
+                <m:lim>
+                  <m:r>
+                    <m:rPr>
+                      <m:nor/>
+                    </m:rPr>
+                    <m:t>Boundary Drawing</m:t>
+                  </m:r>
+                </m:lim>
+              </m:limUpp>
+              <m:r>
+                <m:rPr>
+                  <m:nor/>
+                </m:rPr>
+                <m:t xml:space="preserve">Ought-to-be Model (Self-Consistent Medium, </m:t>
+              </m:r>
+              <m:sSub>
+                <m:sSubPr>
+                  <m:ctrlPr>
+                    <w:rPr>
+                      <w:rFonts w:ascii="Cambria Math" w:hAnsi="Cambria Math"/>
+                    </w:rPr>
+                  </m:ctrlPr>
+                </m:sSubPr>
+                <m:e>
+                  <m:r>
+                    <m:rPr>
+                      <m:scr m:val="script"/>
+                      <m:sty m:val="p"/>
+                    </m:rPr>
+                    <w:rPr>
+                      <w:rFonts w:ascii="Cambria Math" w:hAnsi="Cambria Math"/>
+                    </w:rPr>
+                    <m:t>M</m:t>
+                  </m:r>
+                </m:e>
+                <m:sub>
+                  <m:r>
+                    <m:rPr>
+                      <m:nor/>
+                    </m:rPr>
+                    <m:t>model</m:t>
+                  </m:r>
+                </m:sub>
+              </m:sSub>
+              <m:r>
+                <m:rPr>
+                  <m:nor/>
+                </m:rPr>
+                <m:t>)</m:t>
+              </m:r>
+            </m:e>
+            <m:e>
+              <m:r>
+                <w:rPr>
+                  <w:rFonts w:ascii="Cambria Math" w:hAnsi="Cambria Math"/>
+                </w:rPr>
+                <m:t>&amp;</m:t>
+              </m:r>
+              <m:r>
+                <m:rPr>
+                  <m:sty m:val="p"/>
+                </m:rPr>
+                <w:rPr>
+                  <w:rFonts w:ascii="Cambria Math" w:hAnsi="Cambria Math"/>
+                </w:rPr>
+                <m:t>⟹</m:t>
+              </m:r>
+              <m:r>
+                <m:rPr>
+                  <m:sty m:val="p"/>
+                </m:rPr>
+                <w:rPr>
+                  <w:rFonts w:ascii="Cambria Math" w:hAnsi="Cambria Math"/>
+                </w:rPr>
+                <m:t>⟨</m:t>
+              </m:r>
+              <m:sSub>
+                <m:sSubPr>
+                  <m:ctrlPr>
+                    <w:rPr>
+                      <w:rFonts w:ascii="Cambria Math" w:hAnsi="Cambria Math"/>
+                    </w:rPr>
+                  </m:ctrlPr>
+                </m:sSubPr>
+                <m:e>
+                  <m:r>
+                    <m:rPr>
+                      <m:sty m:val="bi"/>
+                    </m:rPr>
+                    <w:rPr>
+                      <w:rFonts w:ascii="Cambria Math" w:hAnsi="Cambria Math"/>
+                    </w:rPr>
+                    <m:t>v</m:t>
+                  </m:r>
+                </m:e>
+                <m:sub>
+                  <m:r>
+                    <w:rPr>
+                      <w:rFonts w:ascii="Cambria Math" w:hAnsi="Cambria Math"/>
+                    </w:rPr>
+                    <m:t>i</m:t>
+                  </m:r>
+                </m:sub>
+              </m:sSub>
+              <m:r>
+                <m:rPr>
+                  <m:sty m:val="p"/>
+                </m:rPr>
+                <w:rPr>
+                  <w:rFonts w:ascii="Cambria Math" w:hAnsi="Cambria Math"/>
+                </w:rPr>
+                <m:t>,</m:t>
+              </m:r>
+              <m:sSub>
+                <m:sSubPr>
+                  <m:ctrlPr>
+                    <w:rPr>
+                      <w:rFonts w:ascii="Cambria Math" w:hAnsi="Cambria Math"/>
+                    </w:rPr>
+                  </m:ctrlPr>
+                </m:sSubPr>
+                <m:e>
+                  <m:r>
+                    <m:rPr>
+                      <m:sty m:val="bi"/>
+                    </m:rPr>
+                    <w:rPr>
+                      <w:rFonts w:ascii="Cambria Math" w:hAnsi="Cambria Math"/>
+                    </w:rPr>
+                    <m:t>v</m:t>
+                  </m:r>
+                </m:e>
+                <m:sub>
+                  <m:r>
+                    <w:rPr>
+                      <w:rFonts w:ascii="Cambria Math" w:hAnsi="Cambria Math"/>
+                    </w:rPr>
+                    <m:t>j</m:t>
+                  </m:r>
+                </m:sub>
+              </m:sSub>
+              <m:r>
+                <m:rPr>
+                  <m:sty m:val="p"/>
+                </m:rPr>
+                <w:rPr>
+                  <w:rFonts w:ascii="Cambria Math" w:hAnsi="Cambria Math"/>
+                </w:rPr>
+                <m:t>⟩</m:t>
+              </m:r>
+              <m:r>
+                <m:rPr>
+                  <m:sty m:val="p"/>
+                </m:rPr>
+                <w:rPr>
+                  <w:rFonts w:ascii="Cambria Math" w:hAnsi="Cambria Math"/>
+                </w:rPr>
+                <m:t>≥</m:t>
+              </m:r>
+              <m:r>
+                <w:rPr>
+                  <w:rFonts w:ascii="Cambria Math" w:hAnsi="Cambria Math"/>
+                </w:rPr>
+                <m:t>0</m:t>
+              </m:r>
+              <m:r>
+                <m:rPr>
+                  <m:sty m:val="p"/>
+                </m:rPr>
+                <w:rPr>
+                  <w:rFonts w:ascii="Cambria Math" w:hAnsi="Cambria Math"/>
+                </w:rPr>
+                <m:t>⟹</m:t>
+              </m:r>
+              <m:r>
+                <m:rPr>
+                  <m:sty m:val="p"/>
+                </m:rPr>
+                <w:rPr>
+                  <w:rFonts w:ascii="Cambria Math" w:hAnsi="Cambria Math"/>
+                </w:rPr>
+                <m:t>Δ</m:t>
+              </m:r>
+              <m:sSub>
+                <m:sSubPr>
+                  <m:ctrlPr>
+                    <w:rPr>
+                      <w:rFonts w:ascii="Cambria Math" w:hAnsi="Cambria Math"/>
+                    </w:rPr>
+                  </m:ctrlPr>
+                </m:sSubPr>
+                <m:e>
+                  <m:r>
+                    <w:rPr>
+                      <w:rFonts w:ascii="Cambria Math" w:hAnsi="Cambria Math"/>
+                    </w:rPr>
+                    <m:t>W</m:t>
+                  </m:r>
+                </m:e>
+                <m:sub>
+                  <m:r>
+                    <m:rPr>
+                      <m:nor/>
+                    </m:rPr>
+                    <m:t>heat</m:t>
+                  </m:r>
+                </m:sub>
+              </m:sSub>
               <m:r>
                 <m:rPr>
                   <m:sty m:val="p"/>
@@ -390,205 +581,14 @@
                 </w:rPr>
                 <m:t>→</m:t>
               </m:r>
-            </m:e>
-            <m:lim>
-              <m:r>
-                <m:rPr>
-                  <m:nor/>
-                </m:rPr>
-                <m:t>Boundary Drawing</m:t>
-              </m:r>
-            </m:lim>
-          </m:limUpp>
-          <m:r>
-            <m:rPr>
-              <m:nor/>
-            </m:rPr>
-            <m:t>Ought-to-be Model (Self-Consistent Medium, the observer-constructed model)</m:t>
-          </m:r>
-          <m:r>
-            <m:rPr>
-              <m:sty m:val="p"/>
-            </m:rPr>
-            <w:rPr>
-              <w:rFonts w:ascii="Cambria Math" w:hAnsi="Cambria Math"/>
-            </w:rPr>
-            <m:t>⟹</m:t>
-          </m:r>
-          <m:r>
-            <m:rPr>
-              <m:sty m:val="p"/>
-            </m:rPr>
-            <w:rPr>
-              <w:rFonts w:ascii="Cambria Math" w:hAnsi="Cambria Math"/>
-            </w:rPr>
-            <m:t>⟨</m:t>
-          </m:r>
-          <m:sSub>
-            <m:sSubPr>
-              <m:ctrlPr>
-                <w:rPr>
-                  <w:rFonts w:ascii="Cambria Math" w:hAnsi="Cambria Math"/>
-                </w:rPr>
-              </m:ctrlPr>
-            </m:sSubPr>
-            <m:e>
-              <m:acc>
-                <m:accPr>
-                  <m:chr m:val="⃗"/>
-                  <m:ctrlPr>
-                    <w:rPr>
-                      <w:rFonts w:ascii="Cambria Math" w:hAnsi="Cambria Math"/>
-                    </w:rPr>
-                  </m:ctrlPr>
-                </m:accPr>
-                <m:e>
-                  <m:r>
-                    <w:rPr>
-                      <w:rFonts w:ascii="Cambria Math" w:hAnsi="Cambria Math"/>
-                    </w:rPr>
-                    <m:t>v</m:t>
-                  </m:r>
-                </m:e>
-              </m:acc>
-            </m:e>
-            <m:sub>
               <m:r>
                 <w:rPr>
                   <w:rFonts w:ascii="Cambria Math" w:hAnsi="Cambria Math"/>
                 </w:rPr>
-                <m:t>i</m:t>
-              </m:r>
-            </m:sub>
-          </m:sSub>
-          <m:r>
-            <m:rPr>
-              <m:sty m:val="p"/>
-            </m:rPr>
-            <w:rPr>
-              <w:rFonts w:ascii="Cambria Math" w:hAnsi="Cambria Math"/>
-            </w:rPr>
-            <m:t>,</m:t>
-          </m:r>
-          <m:sSub>
-            <m:sSubPr>
-              <m:ctrlPr>
-                <w:rPr>
-                  <w:rFonts w:ascii="Cambria Math" w:hAnsi="Cambria Math"/>
-                </w:rPr>
-              </m:ctrlPr>
-            </m:sSubPr>
-            <m:e>
-              <m:acc>
-                <m:accPr>
-                  <m:chr m:val="⃗"/>
-                  <m:ctrlPr>
-                    <w:rPr>
-                      <w:rFonts w:ascii="Cambria Math" w:hAnsi="Cambria Math"/>
-                    </w:rPr>
-                  </m:ctrlPr>
-                </m:accPr>
-                <m:e>
-                  <m:r>
-                    <w:rPr>
-                      <w:rFonts w:ascii="Cambria Math" w:hAnsi="Cambria Math"/>
-                    </w:rPr>
-                    <m:t>v</m:t>
-                  </m:r>
-                </m:e>
-              </m:acc>
-            </m:e>
-            <m:sub>
-              <m:r>
-                <w:rPr>
-                  <w:rFonts w:ascii="Cambria Math" w:hAnsi="Cambria Math"/>
-                </w:rPr>
-                <m:t>j</m:t>
-              </m:r>
-            </m:sub>
-          </m:sSub>
-          <m:r>
-            <m:rPr>
-              <m:sty m:val="p"/>
-            </m:rPr>
-            <w:rPr>
-              <w:rFonts w:ascii="Cambria Math" w:hAnsi="Cambria Math"/>
-            </w:rPr>
-            <m:t>⟩</m:t>
-          </m:r>
-          <m:r>
-            <m:rPr>
-              <m:sty m:val="p"/>
-            </m:rPr>
-            <w:rPr>
-              <w:rFonts w:ascii="Cambria Math" w:hAnsi="Cambria Math"/>
-            </w:rPr>
-            <m:t>≥</m:t>
-          </m:r>
-          <m:r>
-            <w:rPr>
-              <w:rFonts w:ascii="Cambria Math" w:hAnsi="Cambria Math"/>
-            </w:rPr>
-            <m:t>0</m:t>
-          </m:r>
-          <m:r>
-            <m:rPr>
-              <m:sty m:val="p"/>
-            </m:rPr>
-            <w:rPr>
-              <w:rFonts w:ascii="Cambria Math" w:hAnsi="Cambria Math"/>
-            </w:rPr>
-            <m:t>⟹</m:t>
-          </m:r>
-          <m:r>
-            <m:rPr>
-              <m:sty m:val="p"/>
-            </m:rPr>
-            <w:rPr>
-              <w:rFonts w:ascii="Cambria Math" w:hAnsi="Cambria Math"/>
-            </w:rPr>
-            <m:t>Δ</m:t>
-          </m:r>
-          <m:sSub>
-            <m:sSubPr>
-              <m:ctrlPr>
-                <w:rPr>
-                  <w:rFonts w:ascii="Cambria Math" w:hAnsi="Cambria Math"/>
-                </w:rPr>
-              </m:ctrlPr>
-            </m:sSubPr>
-            <m:e>
-              <m:r>
-                <w:rPr>
-                  <w:rFonts w:ascii="Cambria Math" w:hAnsi="Cambria Math"/>
-                </w:rPr>
-                <m:t>W</m:t>
+                <m:t>0</m:t>
               </m:r>
             </m:e>
-            <m:sub>
-              <m:r>
-                <m:rPr>
-                  <m:nor/>
-                </m:rPr>
-                <m:t>heat</m:t>
-              </m:r>
-            </m:sub>
-          </m:sSub>
-          <m:r>
-            <m:rPr>
-              <m:sty m:val="p"/>
-            </m:rPr>
-            <w:rPr>
-              <w:rFonts w:ascii="Cambria Math" w:hAnsi="Cambria Math"/>
-            </w:rPr>
-            <m:t>→</m:t>
-          </m:r>
-          <m:r>
-            <w:rPr>
-              <w:rFonts w:ascii="Cambria Math" w:hAnsi="Cambria Math"/>
-            </w:rPr>
-            <m:t>0</m:t>
-          </m:r>
+          </m:eqArr>
         </m:oMath>
       </m:oMathPara>
     </w:p>
@@ -1020,10 +1020,7 @@
         <w:t>Disorder</w:t>
       </w:r>
       <w:r>
-        <w:t xml:space="preserve"> </w:t>
-      </w:r>
-      <w:r>
-        <w:t>(latent dependency network broken, elements degraded to isolated sand);</w:t>
+        <w:t xml:space="preserve"> (latent dependency network broken, elements degraded to isolated sand);</w:t>
       </w:r>
     </w:p>
     <w:p>
@@ -1266,21 +1263,7 @@
           <w:b/>
           <w:bCs/>
         </w:rPr>
-        <w:t>【</w:t>
-      </w:r>
-      <w:r>
-        <w:rPr>
-          <w:b/>
-          <w:bCs/>
-        </w:rPr>
-        <w:t>Algebraic Master Equation of the Latter Two Dimensions and Causal-Residual Dual Transformation Law</w:t>
-      </w:r>
-      <w:r>
-        <w:rPr>
-          <w:b/>
-          <w:bCs/>
-        </w:rPr>
-        <w:t>】</w:t>
+        <w:t>[Algebraic Master Equation of the Latter Two Dimensions and Causal-Residual Dual Transformation Law]</w:t>
       </w:r>
       <w:r>
         <w:t>:</w:t>
@@ -1368,10 +1351,15 @@
       <w:r>
         <w:t>:</w:t>
       </w:r>
-      <w:r>
-        <w:br/>
-        <w:t xml:space="preserve">1. </w:t>
-      </w:r>
+    </w:p>
+    <w:p>
+      <w:pPr>
+        <w:pStyle w:val="Compact"/>
+        <w:numPr>
+          <w:ilvl w:val="0"/>
+          <w:numId w:val="4"/>
+        </w:numPr>
+      </w:pPr>
       <w:r>
         <w:rPr>
           <w:b/>
@@ -1440,8 +1428,17 @@
         </m:sSub>
       </m:oMath>
       <w:r>
-        <w:t xml:space="preserve">;   2. </w:t>
-      </w:r>
+        <w:t xml:space="preserve">;  </w:t>
+      </w:r>
+    </w:p>
+    <w:p>
+      <w:pPr>
+        <w:pStyle w:val="Compact"/>
+        <w:numPr>
+          <w:ilvl w:val="0"/>
+          <w:numId w:val="4"/>
+        </w:numPr>
+      </w:pPr>
       <w:r>
         <w:rPr>
           <w:b/>
@@ -1487,24 +1484,137 @@
           <w:b/>
           <w:bCs/>
         </w:rPr>
-        <w:t>【</w:t>
-      </w:r>
+        <w:t>[residual with causality]</w:t>
+      </w:r>
+      <w:r>
+        <w:t xml:space="preserve"> </w:t>
+      </w:r>
+      <m:oMath>
+        <m:r>
+          <m:rPr>
+            <m:sty m:val="p"/>
+          </m:rPr>
+          <w:rPr>
+            <w:rFonts w:ascii="Cambria Math" w:hAnsi="Cambria Math"/>
+          </w:rPr>
+          <m:t>Δ</m:t>
+        </m:r>
+        <m:sSub>
+          <m:sSubPr>
+            <m:ctrlPr>
+              <w:rPr>
+                <w:rFonts w:ascii="Cambria Math" w:hAnsi="Cambria Math"/>
+              </w:rPr>
+            </m:ctrlPr>
+          </m:sSubPr>
+          <m:e>
+            <m:r>
+              <w:rPr>
+                <w:rFonts w:ascii="Cambria Math" w:hAnsi="Cambria Math"/>
+              </w:rPr>
+              <m:t>X</m:t>
+            </m:r>
+          </m:e>
+          <m:sub>
+            <m:r>
+              <m:rPr>
+                <m:nor/>
+              </m:rPr>
+              <m:t>residual</m:t>
+            </m:r>
+          </m:sub>
+        </m:sSub>
+        <m:r>
+          <m:rPr>
+            <m:sty m:val="p"/>
+          </m:rPr>
+          <w:rPr>
+            <w:rFonts w:ascii="Cambria Math" w:hAnsi="Cambria Math"/>
+          </w:rPr>
+          <m:t>=</m:t>
+        </m:r>
+        <m:sSub>
+          <m:sSubPr>
+            <m:ctrlPr>
+              <w:rPr>
+                <w:rFonts w:ascii="Cambria Math" w:hAnsi="Cambria Math"/>
+              </w:rPr>
+            </m:ctrlPr>
+          </m:sSubPr>
+          <m:e>
+            <m:r>
+              <w:rPr>
+                <w:rFonts w:ascii="Cambria Math" w:hAnsi="Cambria Math"/>
+              </w:rPr>
+              <m:t>X</m:t>
+            </m:r>
+          </m:e>
+          <m:sub>
+            <m:r>
+              <m:rPr>
+                <m:nor/>
+              </m:rPr>
+              <m:t>real</m:t>
+            </m:r>
+          </m:sub>
+        </m:sSub>
+        <m:r>
+          <m:rPr>
+            <m:sty m:val="p"/>
+          </m:rPr>
+          <w:rPr>
+            <w:rFonts w:ascii="Cambria Math" w:hAnsi="Cambria Math"/>
+          </w:rPr>
+          <m:t>⊖</m:t>
+        </m:r>
+        <m:sSub>
+          <m:sSubPr>
+            <m:ctrlPr>
+              <w:rPr>
+                <w:rFonts w:ascii="Cambria Math" w:hAnsi="Cambria Math"/>
+              </w:rPr>
+            </m:ctrlPr>
+          </m:sSubPr>
+          <m:e>
+            <m:r>
+              <w:rPr>
+                <w:rFonts w:ascii="Cambria Math" w:hAnsi="Cambria Math"/>
+              </w:rPr>
+              <m:t>X</m:t>
+            </m:r>
+          </m:e>
+          <m:sub>
+            <m:r>
+              <m:rPr>
+                <m:nor/>
+              </m:rPr>
+              <m:t>plan</m:t>
+            </m:r>
+          </m:sub>
+        </m:sSub>
+      </m:oMath>
+      <w:r>
+        <w:t xml:space="preserve">;  </w:t>
+      </w:r>
+    </w:p>
+    <w:p>
+      <w:pPr>
+        <w:pStyle w:val="Compact"/>
+        <w:numPr>
+          <w:ilvl w:val="0"/>
+          <w:numId w:val="4"/>
+        </w:numPr>
+      </w:pPr>
       <w:r>
         <w:rPr>
           <w:b/>
           <w:bCs/>
         </w:rPr>
-        <w:t>residual with causality</w:t>
-      </w:r>
-      <w:r>
-        <w:rPr>
-          <w:b/>
-          <w:bCs/>
-        </w:rPr>
-        <w:t>】</w:t>
-      </w:r>
-      <w:r>
-        <w:t xml:space="preserve"> </w:t>
+        <w:lastRenderedPageBreak/>
+        <w:t>Traceability Judgment along Causal Chain</w:t>
+      </w:r>
+      <w:r>
+        <w:t xml:space="preserve">: Reverse-trace the residual along the original causal chain—if the causal chain holds and only physical entities are obstructed, judge “the world is off”, issuing control work to govern the world; if the causal chain breaks and the feasible set is empty, judge “the model is wrong”, activating second-order meta-cognitive operator </w:t>
       </w:r>
       <m:oMath>
         <m:r>
@@ -1514,140 +1624,16 @@
           <w:rPr>
             <w:rFonts w:ascii="Cambria Math" w:hAnsi="Cambria Math"/>
           </w:rPr>
-          <m:t>Δ</m:t>
-        </m:r>
-        <m:sSub>
-          <m:sSubPr>
-            <m:ctrlPr>
-              <w:rPr>
-                <w:rFonts w:ascii="Cambria Math" w:hAnsi="Cambria Math"/>
-              </w:rPr>
-            </m:ctrlPr>
-          </m:sSubPr>
-          <m:e>
-            <m:r>
-              <w:rPr>
-                <w:rFonts w:ascii="Cambria Math" w:hAnsi="Cambria Math"/>
-              </w:rPr>
-              <m:t>X</m:t>
-            </m:r>
-          </m:e>
-          <m:sub>
-            <m:r>
-              <m:rPr>
-                <m:nor/>
-              </m:rPr>
-              <m:t>residual</m:t>
-            </m:r>
-          </m:sub>
-        </m:sSub>
-        <m:r>
-          <m:rPr>
-            <m:sty m:val="p"/>
-          </m:rPr>
-          <w:rPr>
-            <w:rFonts w:ascii="Cambria Math" w:hAnsi="Cambria Math"/>
-          </w:rPr>
-          <m:t>=</m:t>
-        </m:r>
-        <m:sSub>
-          <m:sSubPr>
-            <m:ctrlPr>
-              <w:rPr>
-                <w:rFonts w:ascii="Cambria Math" w:hAnsi="Cambria Math"/>
-              </w:rPr>
-            </m:ctrlPr>
-          </m:sSubPr>
-          <m:e>
-            <m:r>
-              <w:rPr>
-                <w:rFonts w:ascii="Cambria Math" w:hAnsi="Cambria Math"/>
-              </w:rPr>
-              <m:t>X</m:t>
-            </m:r>
-          </m:e>
-          <m:sub>
-            <m:r>
-              <m:rPr>
-                <m:nor/>
-              </m:rPr>
-              <m:t>real</m:t>
-            </m:r>
-          </m:sub>
-        </m:sSub>
-        <m:r>
-          <m:rPr>
-            <m:sty m:val="p"/>
-          </m:rPr>
-          <w:rPr>
-            <w:rFonts w:ascii="Cambria Math" w:hAnsi="Cambria Math"/>
-          </w:rPr>
-          <m:t>⊖</m:t>
-        </m:r>
-        <m:sSub>
-          <m:sSubPr>
-            <m:ctrlPr>
-              <w:rPr>
-                <w:rFonts w:ascii="Cambria Math" w:hAnsi="Cambria Math"/>
-              </w:rPr>
-            </m:ctrlPr>
-          </m:sSubPr>
-          <m:e>
-            <m:r>
-              <w:rPr>
-                <w:rFonts w:ascii="Cambria Math" w:hAnsi="Cambria Math"/>
-              </w:rPr>
-              <m:t>X</m:t>
-            </m:r>
-          </m:e>
-          <m:sub>
-            <m:r>
-              <m:rPr>
-                <m:nor/>
-              </m:rPr>
-              <m:t>plan</m:t>
-            </m:r>
-          </m:sub>
-        </m:sSub>
+          <m:t>Φ</m:t>
+        </m:r>
       </m:oMath>
       <w:r>
-        <w:t xml:space="preserve">;   3. </w:t>
-      </w:r>
-      <w:r>
-        <w:rPr>
-          <w:b/>
-          <w:bCs/>
-        </w:rPr>
-        <w:t>Traceability Judgment along Causal Chain</w:t>
-      </w:r>
-      <w:r>
-        <w:t xml:space="preserve">: Reverse-trace the residual along the original causal chain—if the causal chain holds and only physical entities are </w:t>
-      </w:r>
-      <w:r>
-        <w:lastRenderedPageBreak/>
-        <w:t xml:space="preserve">obstructed, judge “the world is off”, issuing control work to govern the world; if the causal chain breaks and the feasible set is empty, judge “the model is wrong”, activating second-order meta-cognitive operator </w:t>
-      </w:r>
-      <m:oMath>
-        <m:r>
-          <m:rPr>
-            <m:sty m:val="b"/>
-          </m:rPr>
-          <w:rPr>
-            <w:rFonts w:ascii="Cambria Math" w:hAnsi="Cambria Math"/>
-          </w:rPr>
-          <m:t>Φ</m:t>
-        </m:r>
-      </m:oMath>
-      <w:r>
-        <w:t xml:space="preserve"> </w:t>
-      </w:r>
-      <w:r>
-        <w:t>for constitutional amendment and model reconstruction. If the world is off, adjust execution; if the model is wrong, apply second-order amendment!</w:t>
+        <w:t xml:space="preserve"> for constitutional amendment and model reconstruction. If the world is off, adjust execution; if the model is wrong, apply second-order amendment!</w:t>
       </w:r>
     </w:p>
     <w:p>
       <w:r>
-        <w:pict w14:anchorId="26B1D9EA">
+        <w:pict>
           <v:rect id="_x0000_i1027" style="width:0;height:1.5pt" o:hralign="center" o:hrstd="t" o:hr="t"/>
         </w:pict>
       </w:r>
@@ -2026,6 +2012,18 @@
       </w:pPr>
       <w:r>
         <w:rPr>
+          <w:i/>
+          <w:iCs/>
+        </w:rPr>
+        <w:t>Note: Theorem 2.1 / Proposition 2.2 in this paper are consistent in conclusion with “Causal Finiteness Lemma 1.1” in the Order monograph and Theorem 7.2 / Proposition 7.3 in The Second Renaissance; the numbering differences arise because each paper is written independently.</w:t>
+      </w:r>
+    </w:p>
+    <w:p>
+      <w:pPr>
+        <w:pStyle w:val="aa"/>
+      </w:pPr>
+      <w:r>
+        <w:rPr>
           <w:b/>
           <w:bCs/>
         </w:rPr>
@@ -2816,6 +2814,7 @@
       <w:bookmarkStart w:id="7" w:name="X68b218f9e387e43fde8d7069ef44415012e898a"/>
       <w:bookmarkEnd w:id="6"/>
       <w:r>
+        <w:lastRenderedPageBreak/>
         <w:t>2.2 Left Helix (Form): Proposition 2.2 (Tripartite Definitional Equivalence Proposition)</w:t>
       </w:r>
     </w:p>
@@ -2830,6 +2829,1289 @@
     <w:p>
       <w:pPr>
         <w:pStyle w:val="aa"/>
+      </w:pPr>
+      <w:r>
+        <w:rPr>
+          <w:b/>
+          <w:bCs/>
+        </w:rPr>
+        <w:t xml:space="preserve">[Proposition 2.2 (Traversability </w:t>
+      </w:r>
+      <m:oMath>
+        <m:r>
+          <m:rPr>
+            <m:sty m:val="p"/>
+          </m:rPr>
+          <w:rPr>
+            <w:rFonts w:ascii="Cambria Math" w:hAnsi="Cambria Math"/>
+          </w:rPr>
+          <m:t>≡</m:t>
+        </m:r>
+      </m:oMath>
+      <w:r>
+        <w:rPr>
+          <w:b/>
+          <w:bCs/>
+        </w:rPr>
+        <w:t xml:space="preserve"> Zero Cancellation </w:t>
+      </w:r>
+      <m:oMath>
+        <m:r>
+          <m:rPr>
+            <m:sty m:val="p"/>
+          </m:rPr>
+          <w:rPr>
+            <w:rFonts w:ascii="Cambria Math" w:hAnsi="Cambria Math"/>
+          </w:rPr>
+          <m:t>≡</m:t>
+        </m:r>
+      </m:oMath>
+      <w:r>
+        <w:rPr>
+          <w:b/>
+          <w:bCs/>
+        </w:rPr>
+        <w:t xml:space="preserve"> In-Boundary Absolute Optimality)]</w:t>
+      </w:r>
+      <w:r>
+        <w:br/>
+        <w:t xml:space="preserve">Within a given boundary </w:t>
+      </w:r>
+      <m:oMath>
+        <m:sSub>
+          <m:sSubPr>
+            <m:ctrlPr>
+              <w:rPr>
+                <w:rFonts w:ascii="Cambria Math" w:hAnsi="Cambria Math"/>
+              </w:rPr>
+            </m:ctrlPr>
+          </m:sSubPr>
+          <m:e>
+            <m:r>
+              <m:rPr>
+                <m:nor/>
+              </m:rPr>
+              <m:t>Boundary</m:t>
+            </m:r>
+          </m:e>
+          <m:sub>
+            <m:r>
+              <w:rPr>
+                <w:rFonts w:ascii="Cambria Math" w:hAnsi="Cambria Math"/>
+              </w:rPr>
+              <m:t>k</m:t>
+            </m:r>
+          </m:sub>
+        </m:sSub>
+      </m:oMath>
+      <w:r>
+        <w:t xml:space="preserve">, the constraint manifold </w:t>
+      </w:r>
+      <m:oMath>
+        <m:sSub>
+          <m:sSubPr>
+            <m:ctrlPr>
+              <w:rPr>
+                <w:rFonts w:ascii="Cambria Math" w:hAnsi="Cambria Math"/>
+              </w:rPr>
+            </m:ctrlPr>
+          </m:sSubPr>
+          <m:e>
+            <m:r>
+              <w:rPr>
+                <w:rFonts w:ascii="Cambria Math" w:hAnsi="Cambria Math"/>
+              </w:rPr>
+              <m:t>C</m:t>
+            </m:r>
+          </m:e>
+          <m:sub>
+            <m:r>
+              <w:rPr>
+                <w:rFonts w:ascii="Cambria Math" w:hAnsi="Cambria Math"/>
+              </w:rPr>
+              <m:t>k</m:t>
+            </m:r>
+          </m:sub>
+        </m:sSub>
+        <m:r>
+          <m:rPr>
+            <m:sty m:val="p"/>
+          </m:rPr>
+          <w:rPr>
+            <w:rFonts w:ascii="Cambria Math" w:hAnsi="Cambria Math"/>
+          </w:rPr>
+          <m:t>=</m:t>
+        </m:r>
+        <m:r>
+          <m:rPr>
+            <m:sty m:val="p"/>
+          </m:rPr>
+          <w:rPr>
+            <w:rFonts w:ascii="Cambria Math" w:hAnsi="Cambria Math"/>
+          </w:rPr>
+          <m:t>⟨</m:t>
+        </m:r>
+        <m:sSub>
+          <m:sSubPr>
+            <m:ctrlPr>
+              <w:rPr>
+                <w:rFonts w:ascii="Cambria Math" w:hAnsi="Cambria Math"/>
+              </w:rPr>
+            </m:ctrlPr>
+          </m:sSubPr>
+          <m:e>
+            <m:r>
+              <w:rPr>
+                <w:rFonts w:ascii="Cambria Math" w:hAnsi="Cambria Math"/>
+              </w:rPr>
+              <m:t>C</m:t>
+            </m:r>
+          </m:e>
+          <m:sub>
+            <m:r>
+              <m:rPr>
+                <m:nor/>
+              </m:rPr>
+              <m:t>core</m:t>
+            </m:r>
+          </m:sub>
+        </m:sSub>
+        <m:r>
+          <m:rPr>
+            <m:sty m:val="p"/>
+          </m:rPr>
+          <w:rPr>
+            <w:rFonts w:ascii="Cambria Math" w:hAnsi="Cambria Math"/>
+          </w:rPr>
+          <m:t>,</m:t>
+        </m:r>
+        <m:sSub>
+          <m:sSubPr>
+            <m:ctrlPr>
+              <w:rPr>
+                <w:rFonts w:ascii="Cambria Math" w:hAnsi="Cambria Math"/>
+              </w:rPr>
+            </m:ctrlPr>
+          </m:sSubPr>
+          <m:e>
+            <m:r>
+              <w:rPr>
+                <w:rFonts w:ascii="Cambria Math" w:hAnsi="Cambria Math"/>
+              </w:rPr>
+              <m:t>C</m:t>
+            </m:r>
+          </m:e>
+          <m:sub>
+            <m:r>
+              <m:rPr>
+                <m:nor/>
+              </m:rPr>
+              <m:t>param</m:t>
+            </m:r>
+          </m:sub>
+        </m:sSub>
+        <m:r>
+          <m:rPr>
+            <m:sty m:val="p"/>
+          </m:rPr>
+          <w:rPr>
+            <w:rFonts w:ascii="Cambria Math" w:hAnsi="Cambria Math"/>
+          </w:rPr>
+          <m:t>⟩</m:t>
+        </m:r>
+      </m:oMath>
+      <w:r>
+        <w:t xml:space="preserve"> encodes spatiotemporal exclusivity and flux conservation. The evolution algorithm </w:t>
+      </w:r>
+      <m:oMath>
+        <m:r>
+          <m:rPr>
+            <m:scr m:val="script"/>
+            <m:sty m:val="p"/>
+          </m:rPr>
+          <w:rPr>
+            <w:rFonts w:ascii="Cambria Math" w:hAnsi="Cambria Math"/>
+          </w:rPr>
+          <m:t>A</m:t>
+        </m:r>
+      </m:oMath>
+      <w:r>
+        <w:t xml:space="preserve"> in each step permits only co-directional resonance steps (</w:t>
+      </w:r>
+      <m:oMath>
+        <m:r>
+          <m:rPr>
+            <m:sty m:val="p"/>
+          </m:rPr>
+          <w:rPr>
+            <w:rFonts w:ascii="Cambria Math" w:hAnsi="Cambria Math"/>
+          </w:rPr>
+          <m:t>⟨</m:t>
+        </m:r>
+        <m:sSub>
+          <m:sSubPr>
+            <m:ctrlPr>
+              <w:rPr>
+                <w:rFonts w:ascii="Cambria Math" w:hAnsi="Cambria Math"/>
+              </w:rPr>
+            </m:ctrlPr>
+          </m:sSubPr>
+          <m:e>
+            <m:r>
+              <m:rPr>
+                <m:sty m:val="bi"/>
+              </m:rPr>
+              <w:rPr>
+                <w:rFonts w:ascii="Cambria Math" w:hAnsi="Cambria Math"/>
+              </w:rPr>
+              <m:t>v</m:t>
+            </m:r>
+          </m:e>
+          <m:sub>
+            <m:r>
+              <w:rPr>
+                <w:rFonts w:ascii="Cambria Math" w:hAnsi="Cambria Math"/>
+              </w:rPr>
+              <m:t>i</m:t>
+            </m:r>
+          </m:sub>
+        </m:sSub>
+        <m:r>
+          <m:rPr>
+            <m:sty m:val="p"/>
+          </m:rPr>
+          <w:rPr>
+            <w:rFonts w:ascii="Cambria Math" w:hAnsi="Cambria Math"/>
+          </w:rPr>
+          <m:t>,</m:t>
+        </m:r>
+        <m:sSub>
+          <m:sSubPr>
+            <m:ctrlPr>
+              <w:rPr>
+                <w:rFonts w:ascii="Cambria Math" w:hAnsi="Cambria Math"/>
+              </w:rPr>
+            </m:ctrlPr>
+          </m:sSubPr>
+          <m:e>
+            <m:r>
+              <m:rPr>
+                <m:sty m:val="bi"/>
+              </m:rPr>
+              <w:rPr>
+                <w:rFonts w:ascii="Cambria Math" w:hAnsi="Cambria Math"/>
+              </w:rPr>
+              <m:t>v</m:t>
+            </m:r>
+          </m:e>
+          <m:sub>
+            <m:r>
+              <w:rPr>
+                <w:rFonts w:ascii="Cambria Math" w:hAnsi="Cambria Math"/>
+              </w:rPr>
+              <m:t>j</m:t>
+            </m:r>
+          </m:sub>
+        </m:sSub>
+        <m:r>
+          <m:rPr>
+            <m:sty m:val="p"/>
+          </m:rPr>
+          <w:rPr>
+            <w:rFonts w:ascii="Cambria Math" w:hAnsi="Cambria Math"/>
+          </w:rPr>
+          <m:t>⟩</m:t>
+        </m:r>
+        <m:r>
+          <m:rPr>
+            <m:sty m:val="p"/>
+          </m:rPr>
+          <w:rPr>
+            <w:rFonts w:ascii="Cambria Math" w:hAnsi="Cambria Math"/>
+          </w:rPr>
+          <m:t>≥</m:t>
+        </m:r>
+        <m:r>
+          <w:rPr>
+            <w:rFonts w:ascii="Cambria Math" w:hAnsi="Cambria Math"/>
+          </w:rPr>
+          <m:t>0</m:t>
+        </m:r>
+      </m:oMath>
+      <w:r>
+        <w:t xml:space="preserve">), while pruning operator </w:t>
+      </w:r>
+      <m:oMath>
+        <m:sSub>
+          <m:sSubPr>
+            <m:ctrlPr>
+              <w:rPr>
+                <w:rFonts w:ascii="Cambria Math" w:hAnsi="Cambria Math"/>
+              </w:rPr>
+            </m:ctrlPr>
+          </m:sSubPr>
+          <m:e>
+            <m:r>
+              <m:rPr>
+                <m:sty m:val="p"/>
+              </m:rPr>
+              <w:rPr>
+                <w:rFonts w:ascii="Cambria Math" w:hAnsi="Cambria Math"/>
+              </w:rPr>
+              <m:t>Π</m:t>
+            </m:r>
+          </m:e>
+          <m:sub>
+            <m:r>
+              <m:rPr>
+                <m:sty m:val="p"/>
+              </m:rPr>
+              <w:rPr>
+                <w:rFonts w:ascii="Cambria Math" w:hAnsi="Cambria Math"/>
+              </w:rPr>
+              <m:t>⊥</m:t>
+            </m:r>
+          </m:sub>
+        </m:sSub>
+      </m:oMath>
+      <w:r>
+        <w:t xml:space="preserve"> rigidly prunes non-orthogonal conflicting branches. The trajectory satisfies the tripartite physical equivalence:</w:t>
+      </w:r>
+    </w:p>
+    <w:p>
+      <w:pPr>
+        <w:pStyle w:val="aa"/>
+      </w:pPr>
+      <m:oMath>
+        <m:r>
+          <m:rPr>
+            <m:nor/>
+          </m:rPr>
+          <m:t xml:space="preserve">Algorithm Traverses </m:t>
+        </m:r>
+        <m:sSubSup>
+          <m:sSubSupPr>
+            <m:ctrlPr>
+              <w:rPr>
+                <w:rFonts w:ascii="Cambria Math" w:hAnsi="Cambria Math"/>
+              </w:rPr>
+            </m:ctrlPr>
+          </m:sSubSupPr>
+          <m:e>
+            <m:r>
+              <w:rPr>
+                <w:rFonts w:ascii="Cambria Math" w:hAnsi="Cambria Math"/>
+              </w:rPr>
+              <m:t>S</m:t>
+            </m:r>
+          </m:e>
+          <m:sub>
+            <m:r>
+              <w:rPr>
+                <w:rFonts w:ascii="Cambria Math" w:hAnsi="Cambria Math"/>
+              </w:rPr>
+              <m:t>k</m:t>
+            </m:r>
+          </m:sub>
+          <m:sup>
+            <m:r>
+              <m:rPr>
+                <m:sty m:val="p"/>
+              </m:rPr>
+              <w:rPr>
+                <w:rFonts w:ascii="Cambria Math" w:hAnsi="Cambria Math"/>
+              </w:rPr>
+              <m:t>*</m:t>
+            </m:r>
+          </m:sup>
+        </m:sSubSup>
+        <m:r>
+          <m:rPr>
+            <m:sty m:val="p"/>
+          </m:rPr>
+          <w:rPr>
+            <w:rFonts w:ascii="Cambria Math" w:hAnsi="Cambria Math"/>
+          </w:rPr>
+          <m:t>⇔</m:t>
+        </m:r>
+        <m:r>
+          <m:rPr>
+            <m:nor/>
+          </m:rPr>
+          <m:t xml:space="preserve">Zero Vector Cancellation </m:t>
+        </m:r>
+        <m:r>
+          <m:rPr>
+            <m:sty m:val="p"/>
+          </m:rPr>
+          <w:rPr>
+            <w:rFonts w:ascii="Cambria Math" w:hAnsi="Cambria Math"/>
+          </w:rPr>
+          <m:t>(</m:t>
+        </m:r>
+        <m:sSub>
+          <m:sSubPr>
+            <m:ctrlPr>
+              <w:rPr>
+                <w:rFonts w:ascii="Cambria Math" w:hAnsi="Cambria Math"/>
+              </w:rPr>
+            </m:ctrlPr>
+          </m:sSubPr>
+          <m:e>
+            <m:r>
+              <w:rPr>
+                <w:rFonts w:ascii="Cambria Math" w:hAnsi="Cambria Math"/>
+              </w:rPr>
+              <m:t>W</m:t>
+            </m:r>
+          </m:e>
+          <m:sub>
+            <m:r>
+              <m:rPr>
+                <m:nor/>
+              </m:rPr>
+              <m:t>heat</m:t>
+            </m:r>
+          </m:sub>
+        </m:sSub>
+        <m:r>
+          <m:rPr>
+            <m:sty m:val="p"/>
+          </m:rPr>
+          <w:rPr>
+            <w:rFonts w:ascii="Cambria Math" w:hAnsi="Cambria Math"/>
+          </w:rPr>
+          <m:t>[</m:t>
+        </m:r>
+        <m:sSubSup>
+          <m:sSubSupPr>
+            <m:ctrlPr>
+              <w:rPr>
+                <w:rFonts w:ascii="Cambria Math" w:hAnsi="Cambria Math"/>
+              </w:rPr>
+            </m:ctrlPr>
+          </m:sSubSupPr>
+          <m:e>
+            <m:r>
+              <w:rPr>
+                <w:rFonts w:ascii="Cambria Math" w:hAnsi="Cambria Math"/>
+              </w:rPr>
+              <m:t>S</m:t>
+            </m:r>
+          </m:e>
+          <m:sub>
+            <m:r>
+              <w:rPr>
+                <w:rFonts w:ascii="Cambria Math" w:hAnsi="Cambria Math"/>
+              </w:rPr>
+              <m:t>k</m:t>
+            </m:r>
+          </m:sub>
+          <m:sup>
+            <m:r>
+              <m:rPr>
+                <m:sty m:val="p"/>
+              </m:rPr>
+              <w:rPr>
+                <w:rFonts w:ascii="Cambria Math" w:hAnsi="Cambria Math"/>
+              </w:rPr>
+              <m:t>*</m:t>
+            </m:r>
+          </m:sup>
+        </m:sSubSup>
+        <m:r>
+          <m:rPr>
+            <m:sty m:val="p"/>
+          </m:rPr>
+          <w:rPr>
+            <w:rFonts w:ascii="Cambria Math" w:hAnsi="Cambria Math"/>
+          </w:rPr>
+          <m:t>]=</m:t>
+        </m:r>
+        <m:r>
+          <w:rPr>
+            <w:rFonts w:ascii="Cambria Math" w:hAnsi="Cambria Math"/>
+          </w:rPr>
+          <m:t>0</m:t>
+        </m:r>
+        <m:r>
+          <m:rPr>
+            <m:sty m:val="p"/>
+          </m:rPr>
+          <w:rPr>
+            <w:rFonts w:ascii="Cambria Math" w:hAnsi="Cambria Math"/>
+          </w:rPr>
+          <m:t>)⇔</m:t>
+        </m:r>
+        <m:r>
+          <m:rPr>
+            <m:nor/>
+          </m:rPr>
+          <m:t xml:space="preserve">In-Boundary Global Optimal Trajectory </m:t>
+        </m:r>
+        <m:r>
+          <m:rPr>
+            <m:sty m:val="p"/>
+          </m:rPr>
+          <w:rPr>
+            <w:rFonts w:ascii="Cambria Math" w:hAnsi="Cambria Math"/>
+          </w:rPr>
+          <m:t>(</m:t>
+        </m:r>
+        <m:sSubSup>
+          <m:sSubSupPr>
+            <m:ctrlPr>
+              <w:rPr>
+                <w:rFonts w:ascii="Cambria Math" w:hAnsi="Cambria Math"/>
+              </w:rPr>
+            </m:ctrlPr>
+          </m:sSubSupPr>
+          <m:e>
+            <m:r>
+              <w:rPr>
+                <w:rFonts w:ascii="Cambria Math" w:hAnsi="Cambria Math"/>
+              </w:rPr>
+              <m:t>S</m:t>
+            </m:r>
+          </m:e>
+          <m:sub>
+            <m:r>
+              <w:rPr>
+                <w:rFonts w:ascii="Cambria Math" w:hAnsi="Cambria Math"/>
+              </w:rPr>
+              <m:t>k</m:t>
+            </m:r>
+          </m:sub>
+          <m:sup>
+            <m:r>
+              <m:rPr>
+                <m:sty m:val="p"/>
+              </m:rPr>
+              <w:rPr>
+                <w:rFonts w:ascii="Cambria Math" w:hAnsi="Cambria Math"/>
+              </w:rPr>
+              <m:t>*</m:t>
+            </m:r>
+          </m:sup>
+        </m:sSubSup>
+        <m:r>
+          <m:rPr>
+            <m:sty m:val="p"/>
+          </m:rPr>
+          <w:rPr>
+            <w:rFonts w:ascii="Cambria Math" w:hAnsi="Cambria Math"/>
+          </w:rPr>
+          <m:t>=argmin</m:t>
+        </m:r>
+        <m:sSub>
+          <m:sSubPr>
+            <m:ctrlPr>
+              <w:rPr>
+                <w:rFonts w:ascii="Cambria Math" w:hAnsi="Cambria Math"/>
+              </w:rPr>
+            </m:ctrlPr>
+          </m:sSubPr>
+          <m:e>
+            <m:r>
+              <m:rPr>
+                <m:scr m:val="script"/>
+                <m:sty m:val="p"/>
+              </m:rPr>
+              <w:rPr>
+                <w:rFonts w:ascii="Cambria Math" w:hAnsi="Cambria Math"/>
+              </w:rPr>
+              <m:t>W</m:t>
+            </m:r>
+          </m:e>
+          <m:sub>
+            <m:r>
+              <m:rPr>
+                <m:nor/>
+              </m:rPr>
+              <m:t>heat</m:t>
+            </m:r>
+          </m:sub>
+        </m:sSub>
+        <m:r>
+          <m:rPr>
+            <m:sty m:val="p"/>
+          </m:rPr>
+          <w:rPr>
+            <w:rFonts w:ascii="Cambria Math" w:hAnsi="Cambria Math"/>
+          </w:rPr>
+          <m:t>)</m:t>
+        </m:r>
+      </m:oMath>
+      <w:r>
+        <w:t>​</w:t>
+      </w:r>
+    </w:p>
+    <w:p>
+      <w:pPr>
+        <w:pStyle w:val="FirstParagraph"/>
+      </w:pPr>
+      <w:r>
+        <w:rPr>
+          <w:b/>
+          <w:bCs/>
+        </w:rPr>
+        <w:t>Physical and Logical Derivation</w:t>
+      </w:r>
+      <w:r>
+        <w:t>:</w:t>
+      </w:r>
+    </w:p>
+    <w:p>
+      <w:pPr>
+        <w:pStyle w:val="Compact"/>
+        <w:numPr>
+          <w:ilvl w:val="0"/>
+          <w:numId w:val="5"/>
+        </w:numPr>
+      </w:pPr>
+      <w:r>
+        <w:rPr>
+          <w:b/>
+          <w:bCs/>
+        </w:rPr>
+        <w:t>Physical Definition of Optimality</w:t>
+      </w:r>
+      <w:r>
+        <w:t xml:space="preserve">: In OCGS cybernetics, “optimality” is physically defined as minimizing work waste heat/friction. Since waste heat is non-negative </w:t>
+      </w:r>
+      <m:oMath>
+        <m:sSub>
+          <m:sSubPr>
+            <m:ctrlPr>
+              <w:rPr>
+                <w:rFonts w:ascii="Cambria Math" w:hAnsi="Cambria Math"/>
+              </w:rPr>
+            </m:ctrlPr>
+          </m:sSubPr>
+          <m:e>
+            <m:r>
+              <m:rPr>
+                <m:scr m:val="script"/>
+                <m:sty m:val="p"/>
+              </m:rPr>
+              <w:rPr>
+                <w:rFonts w:ascii="Cambria Math" w:hAnsi="Cambria Math"/>
+              </w:rPr>
+              <m:t>W</m:t>
+            </m:r>
+          </m:e>
+          <m:sub>
+            <m:r>
+              <m:rPr>
+                <m:nor/>
+              </m:rPr>
+              <m:t>heat</m:t>
+            </m:r>
+          </m:sub>
+        </m:sSub>
+        <m:r>
+          <m:rPr>
+            <m:sty m:val="p"/>
+          </m:rPr>
+          <w:rPr>
+            <w:rFonts w:ascii="Cambria Math" w:hAnsi="Cambria Math"/>
+          </w:rPr>
+          <m:t>[</m:t>
+        </m:r>
+        <m:r>
+          <w:rPr>
+            <w:rFonts w:ascii="Cambria Math" w:hAnsi="Cambria Math"/>
+          </w:rPr>
+          <m:t>S</m:t>
+        </m:r>
+        <m:r>
+          <m:rPr>
+            <m:sty m:val="p"/>
+          </m:rPr>
+          <w:rPr>
+            <w:rFonts w:ascii="Cambria Math" w:hAnsi="Cambria Math"/>
+          </w:rPr>
+          <m:t>]≥</m:t>
+        </m:r>
+        <m:r>
+          <w:rPr>
+            <w:rFonts w:ascii="Cambria Math" w:hAnsi="Cambria Math"/>
+          </w:rPr>
+          <m:t>0</m:t>
+        </m:r>
+      </m:oMath>
+      <w:r>
+        <w:t>, zero vector cancellation (</w:t>
+      </w:r>
+      <m:oMath>
+        <m:sSub>
+          <m:sSubPr>
+            <m:ctrlPr>
+              <w:rPr>
+                <w:rFonts w:ascii="Cambria Math" w:hAnsi="Cambria Math"/>
+              </w:rPr>
+            </m:ctrlPr>
+          </m:sSubPr>
+          <m:e>
+            <m:r>
+              <w:rPr>
+                <w:rFonts w:ascii="Cambria Math" w:hAnsi="Cambria Math"/>
+              </w:rPr>
+              <m:t>W</m:t>
+            </m:r>
+          </m:e>
+          <m:sub>
+            <m:r>
+              <m:rPr>
+                <m:nor/>
+              </m:rPr>
+              <m:t>heat</m:t>
+            </m:r>
+          </m:sub>
+        </m:sSub>
+        <m:r>
+          <m:rPr>
+            <m:sty m:val="p"/>
+          </m:rPr>
+          <w:rPr>
+            <w:rFonts w:ascii="Cambria Math" w:hAnsi="Cambria Math"/>
+          </w:rPr>
+          <m:t>[</m:t>
+        </m:r>
+        <m:sSubSup>
+          <m:sSubSupPr>
+            <m:ctrlPr>
+              <w:rPr>
+                <w:rFonts w:ascii="Cambria Math" w:hAnsi="Cambria Math"/>
+              </w:rPr>
+            </m:ctrlPr>
+          </m:sSubSupPr>
+          <m:e>
+            <m:r>
+              <w:rPr>
+                <w:rFonts w:ascii="Cambria Math" w:hAnsi="Cambria Math"/>
+              </w:rPr>
+              <m:t>S</m:t>
+            </m:r>
+          </m:e>
+          <m:sub>
+            <m:r>
+              <w:rPr>
+                <w:rFonts w:ascii="Cambria Math" w:hAnsi="Cambria Math"/>
+              </w:rPr>
+              <m:t>k</m:t>
+            </m:r>
+          </m:sub>
+          <m:sup>
+            <m:r>
+              <m:rPr>
+                <m:sty m:val="p"/>
+              </m:rPr>
+              <w:rPr>
+                <w:rFonts w:ascii="Cambria Math" w:hAnsi="Cambria Math"/>
+              </w:rPr>
+              <m:t>*</m:t>
+            </m:r>
+          </m:sup>
+        </m:sSubSup>
+        <m:r>
+          <m:rPr>
+            <m:sty m:val="p"/>
+          </m:rPr>
+          <w:rPr>
+            <w:rFonts w:ascii="Cambria Math" w:hAnsi="Cambria Math"/>
+          </w:rPr>
+          <m:t>]=</m:t>
+        </m:r>
+        <m:r>
+          <w:rPr>
+            <w:rFonts w:ascii="Cambria Math" w:hAnsi="Cambria Math"/>
+          </w:rPr>
+          <m:t>0</m:t>
+        </m:r>
+      </m:oMath>
+      <w:r>
+        <w:t>) is the necessary and sufficient physical condition for global in-boundary optimality;</w:t>
+      </w:r>
+      <w:r>
+        <w:br/>
+      </w:r>
+    </w:p>
+    <w:p>
+      <w:pPr>
+        <w:pStyle w:val="Compact"/>
+        <w:numPr>
+          <w:ilvl w:val="0"/>
+          <w:numId w:val="5"/>
+        </w:numPr>
+      </w:pPr>
+      <w:r>
+        <w:rPr>
+          <w:b/>
+          <w:bCs/>
+        </w:rPr>
+        <w:t>Algorithmic Condition for Zero Cancellation</w:t>
+      </w:r>
+      <w:r>
+        <w:t xml:space="preserve">: Algorithm </w:t>
+      </w:r>
+      <m:oMath>
+        <m:r>
+          <m:rPr>
+            <m:scr m:val="script"/>
+            <m:sty m:val="p"/>
+          </m:rPr>
+          <w:rPr>
+            <w:rFonts w:ascii="Cambria Math" w:hAnsi="Cambria Math"/>
+          </w:rPr>
+          <m:t>A</m:t>
+        </m:r>
+      </m:oMath>
+      <w:r>
+        <w:t xml:space="preserve"> advances along causal characteristic lines. Pruning operator </w:t>
+      </w:r>
+      <m:oMath>
+        <m:sSub>
+          <m:sSubPr>
+            <m:ctrlPr>
+              <w:rPr>
+                <w:rFonts w:ascii="Cambria Math" w:hAnsi="Cambria Math"/>
+              </w:rPr>
+            </m:ctrlPr>
+          </m:sSubPr>
+          <m:e>
+            <m:r>
+              <m:rPr>
+                <m:sty m:val="p"/>
+              </m:rPr>
+              <w:rPr>
+                <w:rFonts w:ascii="Cambria Math" w:hAnsi="Cambria Math"/>
+              </w:rPr>
+              <m:t>Π</m:t>
+            </m:r>
+          </m:e>
+          <m:sub>
+            <m:r>
+              <m:rPr>
+                <m:sty m:val="p"/>
+              </m:rPr>
+              <w:rPr>
+                <w:rFonts w:ascii="Cambria Math" w:hAnsi="Cambria Math"/>
+              </w:rPr>
+              <m:t>⊥</m:t>
+            </m:r>
+          </m:sub>
+        </m:sSub>
+      </m:oMath>
+      <w:r>
+        <w:t xml:space="preserve"> truncates normal shear components (</w:t>
+      </w:r>
+      <m:oMath>
+        <m:sSub>
+          <m:sSubPr>
+            <m:ctrlPr>
+              <w:rPr>
+                <w:rFonts w:ascii="Cambria Math" w:hAnsi="Cambria Math"/>
+              </w:rPr>
+            </m:ctrlPr>
+          </m:sSubPr>
+          <m:e>
+            <m:r>
+              <m:rPr>
+                <m:sty m:val="bi"/>
+              </m:rPr>
+              <w:rPr>
+                <w:rFonts w:ascii="Cambria Math" w:hAnsi="Cambria Math"/>
+              </w:rPr>
+              <m:t>v</m:t>
+            </m:r>
+          </m:e>
+          <m:sub>
+            <m:r>
+              <m:rPr>
+                <m:sty m:val="p"/>
+              </m:rPr>
+              <w:rPr>
+                <w:rFonts w:ascii="Cambria Math" w:hAnsi="Cambria Math"/>
+              </w:rPr>
+              <m:t>⊥</m:t>
+            </m:r>
+          </m:sub>
+        </m:sSub>
+        <m:r>
+          <m:rPr>
+            <m:sty m:val="p"/>
+          </m:rPr>
+          <w:rPr>
+            <w:rFonts w:ascii="Cambria Math" w:hAnsi="Cambria Math"/>
+          </w:rPr>
+          <m:t>≠</m:t>
+        </m:r>
+        <m:r>
+          <w:rPr>
+            <w:rFonts w:ascii="Cambria Math" w:hAnsi="Cambria Math"/>
+          </w:rPr>
+          <m:t>0</m:t>
+        </m:r>
+      </m:oMath>
+      <w:r>
+        <w:t xml:space="preserve">), ensuring single-step friction vanishes </w:t>
+      </w:r>
+      <m:oMath>
+        <m:r>
+          <w:rPr>
+            <w:rFonts w:ascii="Cambria Math" w:hAnsi="Cambria Math"/>
+          </w:rPr>
+          <m:t>δ</m:t>
+        </m:r>
+        <m:sSubSup>
+          <m:sSubSupPr>
+            <m:ctrlPr>
+              <w:rPr>
+                <w:rFonts w:ascii="Cambria Math" w:hAnsi="Cambria Math"/>
+              </w:rPr>
+            </m:ctrlPr>
+          </m:sSubSupPr>
+          <m:e>
+            <m:r>
+              <w:rPr>
+                <w:rFonts w:ascii="Cambria Math" w:hAnsi="Cambria Math"/>
+              </w:rPr>
+              <m:t>W</m:t>
+            </m:r>
+          </m:e>
+          <m:sub>
+            <m:r>
+              <m:rPr>
+                <m:nor/>
+              </m:rPr>
+              <m:t>heat</m:t>
+            </m:r>
+          </m:sub>
+          <m:sup>
+            <m:r>
+              <m:rPr>
+                <m:sty m:val="p"/>
+              </m:rPr>
+              <w:rPr>
+                <w:rFonts w:ascii="Cambria Math" w:hAnsi="Cambria Math"/>
+              </w:rPr>
+              <m:t>(</m:t>
+            </m:r>
+            <m:r>
+              <w:rPr>
+                <w:rFonts w:ascii="Cambria Math" w:hAnsi="Cambria Math"/>
+              </w:rPr>
+              <m:t>k</m:t>
+            </m:r>
+            <m:r>
+              <m:rPr>
+                <m:sty m:val="p"/>
+              </m:rPr>
+              <w:rPr>
+                <w:rFonts w:ascii="Cambria Math" w:hAnsi="Cambria Math"/>
+              </w:rPr>
+              <m:t>)</m:t>
+            </m:r>
+          </m:sup>
+        </m:sSubSup>
+        <m:r>
+          <m:rPr>
+            <m:sty m:val="p"/>
+          </m:rPr>
+          <w:rPr>
+            <w:rFonts w:ascii="Cambria Math" w:hAnsi="Cambria Math"/>
+          </w:rPr>
+          <m:t>=</m:t>
+        </m:r>
+        <m:r>
+          <w:rPr>
+            <w:rFonts w:ascii="Cambria Math" w:hAnsi="Cambria Math"/>
+          </w:rPr>
+          <m:t>0</m:t>
+        </m:r>
+      </m:oMath>
+      <w:r>
+        <w:t>;</w:t>
+      </w:r>
+      <w:r>
+        <w:br/>
+      </w:r>
+    </w:p>
+    <w:p>
+      <w:pPr>
+        <w:pStyle w:val="Compact"/>
+        <w:numPr>
+          <w:ilvl w:val="0"/>
+          <w:numId w:val="5"/>
+        </w:numPr>
+      </w:pPr>
+      <w:r>
+        <w:rPr>
+          <w:b/>
+          <w:bCs/>
+        </w:rPr>
+        <w:t>Traversability Implies In-Boundary Optimality</w:t>
+      </w:r>
+      <w:r>
+        <w:t xml:space="preserve">: If the trajectory completes all </w:t>
+      </w:r>
+      <m:oMath>
+        <m:r>
+          <w:rPr>
+            <w:rFonts w:ascii="Cambria Math" w:hAnsi="Cambria Math"/>
+          </w:rPr>
+          <m:t>K</m:t>
+        </m:r>
+      </m:oMath>
+      <w:r>
+        <w:t xml:space="preserve"> steps under constraint </w:t>
+      </w:r>
+      <m:oMath>
+        <m:sSub>
+          <m:sSubPr>
+            <m:ctrlPr>
+              <w:rPr>
+                <w:rFonts w:ascii="Cambria Math" w:hAnsi="Cambria Math"/>
+              </w:rPr>
+            </m:ctrlPr>
+          </m:sSubPr>
+          <m:e>
+            <m:r>
+              <w:rPr>
+                <w:rFonts w:ascii="Cambria Math" w:hAnsi="Cambria Math"/>
+              </w:rPr>
+              <m:t>C</m:t>
+            </m:r>
+          </m:e>
+          <m:sub>
+            <m:r>
+              <w:rPr>
+                <w:rFonts w:ascii="Cambria Math" w:hAnsi="Cambria Math"/>
+              </w:rPr>
+              <m:t>k</m:t>
+            </m:r>
+          </m:sub>
+        </m:sSub>
+      </m:oMath>
+      <w:r>
+        <w:t>, cumulative friction is zero (</w:t>
+      </w:r>
+      <m:oMath>
+        <m:sSub>
+          <m:sSubPr>
+            <m:ctrlPr>
+              <w:rPr>
+                <w:rFonts w:ascii="Cambria Math" w:hAnsi="Cambria Math"/>
+              </w:rPr>
+            </m:ctrlPr>
+          </m:sSubPr>
+          <m:e>
+            <m:r>
+              <w:rPr>
+                <w:rFonts w:ascii="Cambria Math" w:hAnsi="Cambria Math"/>
+              </w:rPr>
+              <m:t>W</m:t>
+            </m:r>
+          </m:e>
+          <m:sub>
+            <m:r>
+              <m:rPr>
+                <m:nor/>
+              </m:rPr>
+              <m:t>heat</m:t>
+            </m:r>
+          </m:sub>
+        </m:sSub>
+        <m:r>
+          <m:rPr>
+            <m:sty m:val="p"/>
+          </m:rPr>
+          <w:rPr>
+            <w:rFonts w:ascii="Cambria Math" w:hAnsi="Cambria Math"/>
+          </w:rPr>
+          <m:t>[</m:t>
+        </m:r>
+        <m:sSubSup>
+          <m:sSubSupPr>
+            <m:ctrlPr>
+              <w:rPr>
+                <w:rFonts w:ascii="Cambria Math" w:hAnsi="Cambria Math"/>
+              </w:rPr>
+            </m:ctrlPr>
+          </m:sSubSupPr>
+          <m:e>
+            <m:r>
+              <w:rPr>
+                <w:rFonts w:ascii="Cambria Math" w:hAnsi="Cambria Math"/>
+              </w:rPr>
+              <m:t>S</m:t>
+            </m:r>
+          </m:e>
+          <m:sub>
+            <m:r>
+              <w:rPr>
+                <w:rFonts w:ascii="Cambria Math" w:hAnsi="Cambria Math"/>
+              </w:rPr>
+              <m:t>k</m:t>
+            </m:r>
+          </m:sub>
+          <m:sup>
+            <m:r>
+              <m:rPr>
+                <m:sty m:val="p"/>
+              </m:rPr>
+              <w:rPr>
+                <w:rFonts w:ascii="Cambria Math" w:hAnsi="Cambria Math"/>
+              </w:rPr>
+              <m:t>*</m:t>
+            </m:r>
+          </m:sup>
+        </m:sSubSup>
+        <m:r>
+          <m:rPr>
+            <m:sty m:val="p"/>
+          </m:rPr>
+          <w:rPr>
+            <w:rFonts w:ascii="Cambria Math" w:hAnsi="Cambria Math"/>
+          </w:rPr>
+          <m:t>]=</m:t>
+        </m:r>
+        <m:r>
+          <w:rPr>
+            <w:rFonts w:ascii="Cambria Math" w:hAnsi="Cambria Math"/>
+          </w:rPr>
+          <m:t>0</m:t>
+        </m:r>
+      </m:oMath>
+      <w:r>
+        <w:t>). Hitting physical lower bound zero makes the traversed path naturally and necessarily optimal in-boundary.</w:t>
+      </w:r>
+    </w:p>
+    <w:p>
+      <w:r>
+        <w:pict>
+          <v:rect id="_x0000_i1028" style="width:0;height:1.5pt" o:hralign="center" o:hrstd="t" o:hr="t"/>
+        </w:pict>
+      </w:r>
+    </w:p>
+    <w:p>
+      <w:pPr>
+        <w:pStyle w:val="2"/>
+      </w:pPr>
+      <w:bookmarkStart w:id="8" w:name="X8865c8f59a761ec8df6580e89aa245b13be0598"/>
+      <w:bookmarkEnd w:id="7"/>
+      <w:bookmarkEnd w:id="5"/>
+      <w:r>
+        <w:t>3. Gödelian Incompleteness and Meta-Cognitive Dynamic Re-Bounding</w:t>
+      </w:r>
+    </w:p>
+    <w:p>
+      <w:pPr>
+        <w:pStyle w:val="Compact"/>
+        <w:numPr>
+          <w:ilvl w:val="0"/>
+          <w:numId w:val="6"/>
+        </w:numPr>
+      </w:pPr>
+      <w:r>
+        <w:rPr>
+          <w:b/>
+          <w:bCs/>
+        </w:rPr>
+        <w:t>Gödelian Residual</w:t>
+      </w:r>
+      <w:r>
+        <w:t xml:space="preserve">: Open complex giant systems continuously exchange matter, energy, and information with the environment. By Gödel’s Incompleteness Theorem, any finite boundary drawing </w:t>
+      </w:r>
+      <m:oMath>
+        <m:sSub>
+          <m:sSubPr>
+            <m:ctrlPr>
+              <w:rPr>
+                <w:rFonts w:ascii="Cambria Math" w:hAnsi="Cambria Math"/>
+              </w:rPr>
+            </m:ctrlPr>
+          </m:sSubPr>
+          <m:e>
+            <m:r>
+              <m:rPr>
+                <m:nor/>
+              </m:rPr>
+              <m:t>Boundary</m:t>
+            </m:r>
+          </m:e>
+          <m:sub>
+            <m:r>
+              <w:rPr>
+                <w:rFonts w:ascii="Cambria Math" w:hAnsi="Cambria Math"/>
+              </w:rPr>
+              <m:t>k</m:t>
+            </m:r>
+          </m:sub>
+        </m:sSub>
+      </m:oMath>
+      <w:r>
+        <w:t xml:space="preserve"> cannot envelope external continuous perturbations, inevitably manifesting cotangent residuals exceeding internal computation: </w:t>
+      </w:r>
+      <m:oMath>
+        <m:r>
+          <m:rPr>
+            <m:sty m:val="p"/>
+          </m:rPr>
+          <w:rPr>
+            <w:rFonts w:ascii="Cambria Math" w:hAnsi="Cambria Math"/>
+          </w:rPr>
+          <m:t>∥Δ</m:t>
+        </m:r>
+        <m:r>
+          <w:rPr>
+            <w:rFonts w:ascii="Cambria Math" w:hAnsi="Cambria Math"/>
+          </w:rPr>
+          <m:t>X</m:t>
+        </m:r>
+        <m:r>
+          <m:rPr>
+            <m:sty m:val="p"/>
+          </m:rPr>
+          <w:rPr>
+            <w:rFonts w:ascii="Cambria Math" w:hAnsi="Cambria Math"/>
+          </w:rPr>
+          <m:t>(</m:t>
+        </m:r>
+        <m:r>
+          <w:rPr>
+            <w:rFonts w:ascii="Cambria Math" w:hAnsi="Cambria Math"/>
+          </w:rPr>
+          <m:t>t</m:t>
+        </m:r>
+        <m:r>
+          <m:rPr>
+            <m:sty m:val="p"/>
+          </m:rPr>
+          <w:rPr>
+            <w:rFonts w:ascii="Cambria Math" w:hAnsi="Cambria Math"/>
+          </w:rPr>
+          <m:t>)∥&gt;</m:t>
+        </m:r>
+        <m:r>
+          <w:rPr>
+            <w:rFonts w:ascii="Cambria Math" w:hAnsi="Cambria Math"/>
+          </w:rPr>
+          <m:t>θ</m:t>
+        </m:r>
+      </m:oMath>
+      <w:r>
+        <w:t>.</w:t>
+      </w:r>
+    </w:p>
+    <w:p>
+      <w:pPr>
+        <w:pStyle w:val="Compact"/>
+        <w:numPr>
+          <w:ilvl w:val="0"/>
+          <w:numId w:val="6"/>
+        </w:numPr>
       </w:pPr>
       <w:r>
         <w:rPr>
@@ -2837,1333 +4119,6 @@
           <w:bCs/>
         </w:rPr>
         <w:lastRenderedPageBreak/>
-        <w:t>【</w:t>
-      </w:r>
-      <w:r>
-        <w:rPr>
-          <w:b/>
-          <w:bCs/>
-        </w:rPr>
-        <w:t xml:space="preserve">Proposition 2.2 (Traversability </w:t>
-      </w:r>
-      <m:oMath>
-        <m:r>
-          <m:rPr>
-            <m:sty m:val="p"/>
-          </m:rPr>
-          <w:rPr>
-            <w:rFonts w:ascii="Cambria Math" w:hAnsi="Cambria Math"/>
-          </w:rPr>
-          <m:t>≡</m:t>
-        </m:r>
-      </m:oMath>
-      <w:r>
-        <w:rPr>
-          <w:b/>
-          <w:bCs/>
-        </w:rPr>
-        <w:t xml:space="preserve"> Zero Cancellation </w:t>
-      </w:r>
-      <m:oMath>
-        <m:r>
-          <m:rPr>
-            <m:sty m:val="p"/>
-          </m:rPr>
-          <w:rPr>
-            <w:rFonts w:ascii="Cambria Math" w:hAnsi="Cambria Math"/>
-          </w:rPr>
-          <m:t>≡</m:t>
-        </m:r>
-      </m:oMath>
-      <w:r>
-        <w:rPr>
-          <w:b/>
-          <w:bCs/>
-        </w:rPr>
-        <w:t xml:space="preserve"> In-Boundary Absolute Optimality)</w:t>
-      </w:r>
-      <w:r>
-        <w:rPr>
-          <w:b/>
-          <w:bCs/>
-        </w:rPr>
-        <w:t>】</w:t>
-      </w:r>
-      <w:r>
-        <w:br/>
-        <w:t xml:space="preserve">Within a given boundary </w:t>
-      </w:r>
-      <m:oMath>
-        <m:sSub>
-          <m:sSubPr>
-            <m:ctrlPr>
-              <w:rPr>
-                <w:rFonts w:ascii="Cambria Math" w:hAnsi="Cambria Math"/>
-              </w:rPr>
-            </m:ctrlPr>
-          </m:sSubPr>
-          <m:e>
-            <m:r>
-              <m:rPr>
-                <m:nor/>
-              </m:rPr>
-              <m:t>Boundary</m:t>
-            </m:r>
-          </m:e>
-          <m:sub>
-            <m:r>
-              <w:rPr>
-                <w:rFonts w:ascii="Cambria Math" w:hAnsi="Cambria Math"/>
-              </w:rPr>
-              <m:t>k</m:t>
-            </m:r>
-          </m:sub>
-        </m:sSub>
-      </m:oMath>
-      <w:r>
-        <w:t xml:space="preserve">, the constraint manifold </w:t>
-      </w:r>
-      <m:oMath>
-        <m:sSub>
-          <m:sSubPr>
-            <m:ctrlPr>
-              <w:rPr>
-                <w:rFonts w:ascii="Cambria Math" w:hAnsi="Cambria Math"/>
-              </w:rPr>
-            </m:ctrlPr>
-          </m:sSubPr>
-          <m:e>
-            <m:r>
-              <w:rPr>
-                <w:rFonts w:ascii="Cambria Math" w:hAnsi="Cambria Math"/>
-              </w:rPr>
-              <m:t>C</m:t>
-            </m:r>
-          </m:e>
-          <m:sub>
-            <m:r>
-              <w:rPr>
-                <w:rFonts w:ascii="Cambria Math" w:hAnsi="Cambria Math"/>
-              </w:rPr>
-              <m:t>k</m:t>
-            </m:r>
-          </m:sub>
-        </m:sSub>
-        <m:r>
-          <m:rPr>
-            <m:sty m:val="p"/>
-          </m:rPr>
-          <w:rPr>
-            <w:rFonts w:ascii="Cambria Math" w:hAnsi="Cambria Math"/>
-          </w:rPr>
-          <m:t>=</m:t>
-        </m:r>
-        <m:r>
-          <m:rPr>
-            <m:sty m:val="p"/>
-          </m:rPr>
-          <w:rPr>
-            <w:rFonts w:ascii="Cambria Math" w:hAnsi="Cambria Math"/>
-          </w:rPr>
-          <m:t>⟨</m:t>
-        </m:r>
-        <m:sSub>
-          <m:sSubPr>
-            <m:ctrlPr>
-              <w:rPr>
-                <w:rFonts w:ascii="Cambria Math" w:hAnsi="Cambria Math"/>
-              </w:rPr>
-            </m:ctrlPr>
-          </m:sSubPr>
-          <m:e>
-            <m:r>
-              <w:rPr>
-                <w:rFonts w:ascii="Cambria Math" w:hAnsi="Cambria Math"/>
-              </w:rPr>
-              <m:t>C</m:t>
-            </m:r>
-          </m:e>
-          <m:sub>
-            <m:r>
-              <m:rPr>
-                <m:nor/>
-              </m:rPr>
-              <m:t>core</m:t>
-            </m:r>
-          </m:sub>
-        </m:sSub>
-        <m:r>
-          <m:rPr>
-            <m:sty m:val="p"/>
-          </m:rPr>
-          <w:rPr>
-            <w:rFonts w:ascii="Cambria Math" w:hAnsi="Cambria Math"/>
-          </w:rPr>
-          <m:t>,</m:t>
-        </m:r>
-        <m:sSub>
-          <m:sSubPr>
-            <m:ctrlPr>
-              <w:rPr>
-                <w:rFonts w:ascii="Cambria Math" w:hAnsi="Cambria Math"/>
-              </w:rPr>
-            </m:ctrlPr>
-          </m:sSubPr>
-          <m:e>
-            <m:r>
-              <w:rPr>
-                <w:rFonts w:ascii="Cambria Math" w:hAnsi="Cambria Math"/>
-              </w:rPr>
-              <m:t>C</m:t>
-            </m:r>
-          </m:e>
-          <m:sub>
-            <m:r>
-              <m:rPr>
-                <m:nor/>
-              </m:rPr>
-              <m:t>param</m:t>
-            </m:r>
-          </m:sub>
-        </m:sSub>
-        <m:r>
-          <m:rPr>
-            <m:sty m:val="p"/>
-          </m:rPr>
-          <w:rPr>
-            <w:rFonts w:ascii="Cambria Math" w:hAnsi="Cambria Math"/>
-          </w:rPr>
-          <m:t>⟩</m:t>
-        </m:r>
-      </m:oMath>
-      <w:r>
-        <w:t xml:space="preserve"> encodes spatiotemporal exclusivity and flux conservation. The evolution algorithm </w:t>
-      </w:r>
-      <m:oMath>
-        <m:r>
-          <m:rPr>
-            <m:scr m:val="script"/>
-            <m:sty m:val="p"/>
-          </m:rPr>
-          <w:rPr>
-            <w:rFonts w:ascii="Cambria Math" w:hAnsi="Cambria Math"/>
-          </w:rPr>
-          <m:t>A</m:t>
-        </m:r>
-      </m:oMath>
-      <w:r>
-        <w:t xml:space="preserve"> in each step permits only co-directional resonance steps (</w:t>
-      </w:r>
-      <m:oMath>
-        <m:r>
-          <m:rPr>
-            <m:sty m:val="p"/>
-          </m:rPr>
-          <w:rPr>
-            <w:rFonts w:ascii="Cambria Math" w:hAnsi="Cambria Math"/>
-          </w:rPr>
-          <m:t>⟨</m:t>
-        </m:r>
-        <m:sSub>
-          <m:sSubPr>
-            <m:ctrlPr>
-              <w:rPr>
-                <w:rFonts w:ascii="Cambria Math" w:hAnsi="Cambria Math"/>
-              </w:rPr>
-            </m:ctrlPr>
-          </m:sSubPr>
-          <m:e>
-            <m:acc>
-              <m:accPr>
-                <m:chr m:val="⃗"/>
-                <m:ctrlPr>
-                  <w:rPr>
-                    <w:rFonts w:ascii="Cambria Math" w:hAnsi="Cambria Math"/>
-                  </w:rPr>
-                </m:ctrlPr>
-              </m:accPr>
-              <m:e>
-                <m:r>
-                  <w:rPr>
-                    <w:rFonts w:ascii="Cambria Math" w:hAnsi="Cambria Math"/>
-                  </w:rPr>
-                  <m:t>v</m:t>
-                </m:r>
-              </m:e>
-            </m:acc>
-          </m:e>
-          <m:sub>
-            <m:r>
-              <w:rPr>
-                <w:rFonts w:ascii="Cambria Math" w:hAnsi="Cambria Math"/>
-              </w:rPr>
-              <m:t>i</m:t>
-            </m:r>
-          </m:sub>
-        </m:sSub>
-        <m:r>
-          <m:rPr>
-            <m:sty m:val="p"/>
-          </m:rPr>
-          <w:rPr>
-            <w:rFonts w:ascii="Cambria Math" w:hAnsi="Cambria Math"/>
-          </w:rPr>
-          <m:t>,</m:t>
-        </m:r>
-        <m:sSub>
-          <m:sSubPr>
-            <m:ctrlPr>
-              <w:rPr>
-                <w:rFonts w:ascii="Cambria Math" w:hAnsi="Cambria Math"/>
-              </w:rPr>
-            </m:ctrlPr>
-          </m:sSubPr>
-          <m:e>
-            <m:acc>
-              <m:accPr>
-                <m:chr m:val="⃗"/>
-                <m:ctrlPr>
-                  <w:rPr>
-                    <w:rFonts w:ascii="Cambria Math" w:hAnsi="Cambria Math"/>
-                  </w:rPr>
-                </m:ctrlPr>
-              </m:accPr>
-              <m:e>
-                <m:r>
-                  <w:rPr>
-                    <w:rFonts w:ascii="Cambria Math" w:hAnsi="Cambria Math"/>
-                  </w:rPr>
-                  <m:t>v</m:t>
-                </m:r>
-              </m:e>
-            </m:acc>
-          </m:e>
-          <m:sub>
-            <m:r>
-              <w:rPr>
-                <w:rFonts w:ascii="Cambria Math" w:hAnsi="Cambria Math"/>
-              </w:rPr>
-              <m:t>j</m:t>
-            </m:r>
-          </m:sub>
-        </m:sSub>
-        <m:r>
-          <m:rPr>
-            <m:sty m:val="p"/>
-          </m:rPr>
-          <w:rPr>
-            <w:rFonts w:ascii="Cambria Math" w:hAnsi="Cambria Math"/>
-          </w:rPr>
-          <m:t>⟩</m:t>
-        </m:r>
-        <m:r>
-          <m:rPr>
-            <m:sty m:val="p"/>
-          </m:rPr>
-          <w:rPr>
-            <w:rFonts w:ascii="Cambria Math" w:hAnsi="Cambria Math"/>
-          </w:rPr>
-          <m:t>≥</m:t>
-        </m:r>
-        <m:r>
-          <w:rPr>
-            <w:rFonts w:ascii="Cambria Math" w:hAnsi="Cambria Math"/>
-          </w:rPr>
-          <m:t>0</m:t>
-        </m:r>
-      </m:oMath>
-      <w:r>
-        <w:t xml:space="preserve">), while pruning operator </w:t>
-      </w:r>
-      <m:oMath>
-        <m:sSub>
-          <m:sSubPr>
-            <m:ctrlPr>
-              <w:rPr>
-                <w:rFonts w:ascii="Cambria Math" w:hAnsi="Cambria Math"/>
-              </w:rPr>
-            </m:ctrlPr>
-          </m:sSubPr>
-          <m:e>
-            <m:r>
-              <m:rPr>
-                <m:sty m:val="b"/>
-              </m:rPr>
-              <w:rPr>
-                <w:rFonts w:ascii="Cambria Math" w:hAnsi="Cambria Math"/>
-              </w:rPr>
-              <m:t>Π</m:t>
-            </m:r>
-          </m:e>
-          <m:sub>
-            <m:r>
-              <m:rPr>
-                <m:sty m:val="p"/>
-              </m:rPr>
-              <w:rPr>
-                <w:rFonts w:ascii="Cambria Math" w:hAnsi="Cambria Math"/>
-              </w:rPr>
-              <m:t>⊥</m:t>
-            </m:r>
-          </m:sub>
-        </m:sSub>
-      </m:oMath>
-      <w:r>
-        <w:t xml:space="preserve"> rigidly prunes non-orthogonal conflicting branches. The trajectory satisfies the tripartite physical equivalence:</w:t>
-      </w:r>
-    </w:p>
-    <w:p>
-      <w:pPr>
-        <w:pStyle w:val="aa"/>
-      </w:pPr>
-      <m:oMath>
-        <m:r>
-          <m:rPr>
-            <m:nor/>
-          </m:rPr>
-          <m:t xml:space="preserve">Algorithm Traverses </m:t>
-        </m:r>
-        <m:sSubSup>
-          <m:sSubSupPr>
-            <m:ctrlPr>
-              <w:rPr>
-                <w:rFonts w:ascii="Cambria Math" w:hAnsi="Cambria Math"/>
-              </w:rPr>
-            </m:ctrlPr>
-          </m:sSubSupPr>
-          <m:e>
-            <m:r>
-              <w:rPr>
-                <w:rFonts w:ascii="Cambria Math" w:hAnsi="Cambria Math"/>
-              </w:rPr>
-              <m:t>S</m:t>
-            </m:r>
-          </m:e>
-          <m:sub>
-            <m:r>
-              <w:rPr>
-                <w:rFonts w:ascii="Cambria Math" w:hAnsi="Cambria Math"/>
-              </w:rPr>
-              <m:t>k</m:t>
-            </m:r>
-          </m:sub>
-          <m:sup>
-            <m:r>
-              <m:rPr>
-                <m:sty m:val="p"/>
-              </m:rPr>
-              <w:rPr>
-                <w:rFonts w:ascii="Cambria Math" w:hAnsi="Cambria Math"/>
-              </w:rPr>
-              <m:t>*</m:t>
-            </m:r>
-          </m:sup>
-        </m:sSubSup>
-        <m:r>
-          <m:rPr>
-            <m:sty m:val="p"/>
-          </m:rPr>
-          <w:rPr>
-            <w:rFonts w:ascii="Cambria Math" w:hAnsi="Cambria Math"/>
-          </w:rPr>
-          <m:t>⇔</m:t>
-        </m:r>
-        <m:r>
-          <m:rPr>
-            <m:nor/>
-          </m:rPr>
-          <m:t xml:space="preserve">Zero Vector Cancellation </m:t>
-        </m:r>
-        <m:r>
-          <m:rPr>
-            <m:sty m:val="p"/>
-          </m:rPr>
-          <w:rPr>
-            <w:rFonts w:ascii="Cambria Math" w:hAnsi="Cambria Math"/>
-          </w:rPr>
-          <m:t>(</m:t>
-        </m:r>
-        <m:sSub>
-          <m:sSubPr>
-            <m:ctrlPr>
-              <w:rPr>
-                <w:rFonts w:ascii="Cambria Math" w:hAnsi="Cambria Math"/>
-              </w:rPr>
-            </m:ctrlPr>
-          </m:sSubPr>
-          <m:e>
-            <m:r>
-              <w:rPr>
-                <w:rFonts w:ascii="Cambria Math" w:hAnsi="Cambria Math"/>
-              </w:rPr>
-              <m:t>W</m:t>
-            </m:r>
-          </m:e>
-          <m:sub>
-            <m:r>
-              <m:rPr>
-                <m:nor/>
-              </m:rPr>
-              <m:t>heat</m:t>
-            </m:r>
-          </m:sub>
-        </m:sSub>
-        <m:r>
-          <m:rPr>
-            <m:sty m:val="p"/>
-          </m:rPr>
-          <w:rPr>
-            <w:rFonts w:ascii="Cambria Math" w:hAnsi="Cambria Math"/>
-          </w:rPr>
-          <m:t>[</m:t>
-        </m:r>
-        <m:sSubSup>
-          <m:sSubSupPr>
-            <m:ctrlPr>
-              <w:rPr>
-                <w:rFonts w:ascii="Cambria Math" w:hAnsi="Cambria Math"/>
-              </w:rPr>
-            </m:ctrlPr>
-          </m:sSubSupPr>
-          <m:e>
-            <m:r>
-              <w:rPr>
-                <w:rFonts w:ascii="Cambria Math" w:hAnsi="Cambria Math"/>
-              </w:rPr>
-              <m:t>S</m:t>
-            </m:r>
-          </m:e>
-          <m:sub>
-            <m:r>
-              <w:rPr>
-                <w:rFonts w:ascii="Cambria Math" w:hAnsi="Cambria Math"/>
-              </w:rPr>
-              <m:t>k</m:t>
-            </m:r>
-          </m:sub>
-          <m:sup>
-            <m:r>
-              <m:rPr>
-                <m:sty m:val="p"/>
-              </m:rPr>
-              <w:rPr>
-                <w:rFonts w:ascii="Cambria Math" w:hAnsi="Cambria Math"/>
-              </w:rPr>
-              <m:t>*</m:t>
-            </m:r>
-          </m:sup>
-        </m:sSubSup>
-        <m:r>
-          <m:rPr>
-            <m:sty m:val="p"/>
-          </m:rPr>
-          <w:rPr>
-            <w:rFonts w:ascii="Cambria Math" w:hAnsi="Cambria Math"/>
-          </w:rPr>
-          <m:t>]=</m:t>
-        </m:r>
-        <m:r>
-          <w:rPr>
-            <w:rFonts w:ascii="Cambria Math" w:hAnsi="Cambria Math"/>
-          </w:rPr>
-          <m:t>0</m:t>
-        </m:r>
-        <m:r>
-          <m:rPr>
-            <m:sty m:val="p"/>
-          </m:rPr>
-          <w:rPr>
-            <w:rFonts w:ascii="Cambria Math" w:hAnsi="Cambria Math"/>
-          </w:rPr>
-          <m:t>)⇔</m:t>
-        </m:r>
-        <m:r>
-          <m:rPr>
-            <m:nor/>
-          </m:rPr>
-          <m:t xml:space="preserve">In-Boundary Global Optimal Trajectory </m:t>
-        </m:r>
-        <m:r>
-          <m:rPr>
-            <m:sty m:val="p"/>
-          </m:rPr>
-          <w:rPr>
-            <w:rFonts w:ascii="Cambria Math" w:hAnsi="Cambria Math"/>
-          </w:rPr>
-          <m:t>(</m:t>
-        </m:r>
-        <m:sSubSup>
-          <m:sSubSupPr>
-            <m:ctrlPr>
-              <w:rPr>
-                <w:rFonts w:ascii="Cambria Math" w:hAnsi="Cambria Math"/>
-              </w:rPr>
-            </m:ctrlPr>
-          </m:sSubSupPr>
-          <m:e>
-            <m:r>
-              <w:rPr>
-                <w:rFonts w:ascii="Cambria Math" w:hAnsi="Cambria Math"/>
-              </w:rPr>
-              <m:t>S</m:t>
-            </m:r>
-          </m:e>
-          <m:sub>
-            <m:r>
-              <w:rPr>
-                <w:rFonts w:ascii="Cambria Math" w:hAnsi="Cambria Math"/>
-              </w:rPr>
-              <m:t>k</m:t>
-            </m:r>
-          </m:sub>
-          <m:sup>
-            <m:r>
-              <m:rPr>
-                <m:sty m:val="p"/>
-              </m:rPr>
-              <w:rPr>
-                <w:rFonts w:ascii="Cambria Math" w:hAnsi="Cambria Math"/>
-              </w:rPr>
-              <m:t>*</m:t>
-            </m:r>
-          </m:sup>
-        </m:sSubSup>
-        <m:r>
-          <m:rPr>
-            <m:sty m:val="p"/>
-          </m:rPr>
-          <w:rPr>
-            <w:rFonts w:ascii="Cambria Math" w:hAnsi="Cambria Math"/>
-          </w:rPr>
-          <m:t>=argmin</m:t>
-        </m:r>
-        <m:sSub>
-          <m:sSubPr>
-            <m:ctrlPr>
-              <w:rPr>
-                <w:rFonts w:ascii="Cambria Math" w:hAnsi="Cambria Math"/>
-              </w:rPr>
-            </m:ctrlPr>
-          </m:sSubPr>
-          <m:e>
-            <m:r>
-              <m:rPr>
-                <m:scr m:val="script"/>
-                <m:sty m:val="p"/>
-              </m:rPr>
-              <w:rPr>
-                <w:rFonts w:ascii="Cambria Math" w:hAnsi="Cambria Math"/>
-              </w:rPr>
-              <m:t>W</m:t>
-            </m:r>
-          </m:e>
-          <m:sub>
-            <m:r>
-              <m:rPr>
-                <m:nor/>
-              </m:rPr>
-              <m:t>heat</m:t>
-            </m:r>
-          </m:sub>
-        </m:sSub>
-        <m:r>
-          <m:rPr>
-            <m:sty m:val="p"/>
-          </m:rPr>
-          <w:rPr>
-            <w:rFonts w:ascii="Cambria Math" w:hAnsi="Cambria Math"/>
-          </w:rPr>
-          <m:t>)</m:t>
-        </m:r>
-      </m:oMath>
-      <w:r>
-        <w:t>​</w:t>
-      </w:r>
-    </w:p>
-    <w:p>
-      <w:pPr>
-        <w:pStyle w:val="FirstParagraph"/>
-      </w:pPr>
-      <w:r>
-        <w:rPr>
-          <w:b/>
-          <w:bCs/>
-        </w:rPr>
-        <w:t>Physical and Logical Derivation</w:t>
-      </w:r>
-      <w:r>
-        <w:t>:</w:t>
-      </w:r>
-    </w:p>
-    <w:p>
-      <w:pPr>
-        <w:pStyle w:val="Compact"/>
-        <w:numPr>
-          <w:ilvl w:val="0"/>
-          <w:numId w:val="4"/>
-        </w:numPr>
-      </w:pPr>
-      <w:r>
-        <w:rPr>
-          <w:b/>
-          <w:bCs/>
-        </w:rPr>
-        <w:t>Physical Definition of Optimality</w:t>
-      </w:r>
-      <w:r>
-        <w:t xml:space="preserve">: In OCGS cybernetics, “optimality” </w:t>
-      </w:r>
-      <w:r>
-        <w:t xml:space="preserve">is physically defined as minimizing work waste heat/friction. Since waste heat is non-negative </w:t>
-      </w:r>
-      <m:oMath>
-        <m:sSub>
-          <m:sSubPr>
-            <m:ctrlPr>
-              <w:rPr>
-                <w:rFonts w:ascii="Cambria Math" w:hAnsi="Cambria Math"/>
-              </w:rPr>
-            </m:ctrlPr>
-          </m:sSubPr>
-          <m:e>
-            <m:r>
-              <m:rPr>
-                <m:scr m:val="script"/>
-                <m:sty m:val="p"/>
-              </m:rPr>
-              <w:rPr>
-                <w:rFonts w:ascii="Cambria Math" w:hAnsi="Cambria Math"/>
-              </w:rPr>
-              <m:t>W</m:t>
-            </m:r>
-          </m:e>
-          <m:sub>
-            <m:r>
-              <m:rPr>
-                <m:nor/>
-              </m:rPr>
-              <m:t>heat</m:t>
-            </m:r>
-          </m:sub>
-        </m:sSub>
-        <m:r>
-          <m:rPr>
-            <m:sty m:val="p"/>
-          </m:rPr>
-          <w:rPr>
-            <w:rFonts w:ascii="Cambria Math" w:hAnsi="Cambria Math"/>
-          </w:rPr>
-          <m:t>[</m:t>
-        </m:r>
-        <m:r>
-          <w:rPr>
-            <w:rFonts w:ascii="Cambria Math" w:hAnsi="Cambria Math"/>
-          </w:rPr>
-          <m:t>S</m:t>
-        </m:r>
-        <m:r>
-          <m:rPr>
-            <m:sty m:val="p"/>
-          </m:rPr>
-          <w:rPr>
-            <w:rFonts w:ascii="Cambria Math" w:hAnsi="Cambria Math"/>
-          </w:rPr>
-          <m:t>]≥</m:t>
-        </m:r>
-        <m:r>
-          <w:rPr>
-            <w:rFonts w:ascii="Cambria Math" w:hAnsi="Cambria Math"/>
-          </w:rPr>
-          <m:t>0</m:t>
-        </m:r>
-      </m:oMath>
-      <w:r>
-        <w:t>, zero vector cancellation (</w:t>
-      </w:r>
-      <m:oMath>
-        <m:sSub>
-          <m:sSubPr>
-            <m:ctrlPr>
-              <w:rPr>
-                <w:rFonts w:ascii="Cambria Math" w:hAnsi="Cambria Math"/>
-              </w:rPr>
-            </m:ctrlPr>
-          </m:sSubPr>
-          <m:e>
-            <m:r>
-              <w:rPr>
-                <w:rFonts w:ascii="Cambria Math" w:hAnsi="Cambria Math"/>
-              </w:rPr>
-              <m:t>W</m:t>
-            </m:r>
-          </m:e>
-          <m:sub>
-            <m:r>
-              <m:rPr>
-                <m:nor/>
-              </m:rPr>
-              <m:t>heat</m:t>
-            </m:r>
-          </m:sub>
-        </m:sSub>
-        <m:r>
-          <m:rPr>
-            <m:sty m:val="p"/>
-          </m:rPr>
-          <w:rPr>
-            <w:rFonts w:ascii="Cambria Math" w:hAnsi="Cambria Math"/>
-          </w:rPr>
-          <m:t>[</m:t>
-        </m:r>
-        <m:sSubSup>
-          <m:sSubSupPr>
-            <m:ctrlPr>
-              <w:rPr>
-                <w:rFonts w:ascii="Cambria Math" w:hAnsi="Cambria Math"/>
-              </w:rPr>
-            </m:ctrlPr>
-          </m:sSubSupPr>
-          <m:e>
-            <m:r>
-              <w:rPr>
-                <w:rFonts w:ascii="Cambria Math" w:hAnsi="Cambria Math"/>
-              </w:rPr>
-              <m:t>S</m:t>
-            </m:r>
-          </m:e>
-          <m:sub>
-            <m:r>
-              <w:rPr>
-                <w:rFonts w:ascii="Cambria Math" w:hAnsi="Cambria Math"/>
-              </w:rPr>
-              <m:t>k</m:t>
-            </m:r>
-          </m:sub>
-          <m:sup>
-            <m:r>
-              <m:rPr>
-                <m:sty m:val="p"/>
-              </m:rPr>
-              <w:rPr>
-                <w:rFonts w:ascii="Cambria Math" w:hAnsi="Cambria Math"/>
-              </w:rPr>
-              <m:t>*</m:t>
-            </m:r>
-          </m:sup>
-        </m:sSubSup>
-        <m:r>
-          <m:rPr>
-            <m:sty m:val="p"/>
-          </m:rPr>
-          <w:rPr>
-            <w:rFonts w:ascii="Cambria Math" w:hAnsi="Cambria Math"/>
-          </w:rPr>
-          <m:t>]=</m:t>
-        </m:r>
-        <m:r>
-          <w:rPr>
-            <w:rFonts w:ascii="Cambria Math" w:hAnsi="Cambria Math"/>
-          </w:rPr>
-          <m:t>0</m:t>
-        </m:r>
-      </m:oMath>
-      <w:r>
-        <w:t>) is the necessary and sufficient physical condition for global in-boundary optimality;</w:t>
-      </w:r>
-      <w:r>
-        <w:br/>
-      </w:r>
-    </w:p>
-    <w:p>
-      <w:pPr>
-        <w:pStyle w:val="Compact"/>
-        <w:numPr>
-          <w:ilvl w:val="0"/>
-          <w:numId w:val="4"/>
-        </w:numPr>
-      </w:pPr>
-      <w:r>
-        <w:rPr>
-          <w:b/>
-          <w:bCs/>
-        </w:rPr>
-        <w:t>Algorithmic Condition for Zero Cancellation</w:t>
-      </w:r>
-      <w:r>
-        <w:t xml:space="preserve">: Algorithm </w:t>
-      </w:r>
-      <m:oMath>
-        <m:r>
-          <m:rPr>
-            <m:scr m:val="script"/>
-            <m:sty m:val="p"/>
-          </m:rPr>
-          <w:rPr>
-            <w:rFonts w:ascii="Cambria Math" w:hAnsi="Cambria Math"/>
-          </w:rPr>
-          <m:t>A</m:t>
-        </m:r>
-      </m:oMath>
-      <w:r>
-        <w:t xml:space="preserve"> advances along causal characteristic lines. Pruning operator </w:t>
-      </w:r>
-      <m:oMath>
-        <m:sSub>
-          <m:sSubPr>
-            <m:ctrlPr>
-              <w:rPr>
-                <w:rFonts w:ascii="Cambria Math" w:hAnsi="Cambria Math"/>
-              </w:rPr>
-            </m:ctrlPr>
-          </m:sSubPr>
-          <m:e>
-            <m:r>
-              <m:rPr>
-                <m:sty m:val="b"/>
-              </m:rPr>
-              <w:rPr>
-                <w:rFonts w:ascii="Cambria Math" w:hAnsi="Cambria Math"/>
-              </w:rPr>
-              <m:t>Π</m:t>
-            </m:r>
-          </m:e>
-          <m:sub>
-            <m:r>
-              <m:rPr>
-                <m:sty m:val="p"/>
-              </m:rPr>
-              <w:rPr>
-                <w:rFonts w:ascii="Cambria Math" w:hAnsi="Cambria Math"/>
-              </w:rPr>
-              <m:t>⊥</m:t>
-            </m:r>
-          </m:sub>
-        </m:sSub>
-      </m:oMath>
-      <w:r>
-        <w:t xml:space="preserve"> truncates normal shear components (</w:t>
-      </w:r>
-      <m:oMath>
-        <m:sSub>
-          <m:sSubPr>
-            <m:ctrlPr>
-              <w:rPr>
-                <w:rFonts w:ascii="Cambria Math" w:hAnsi="Cambria Math"/>
-              </w:rPr>
-            </m:ctrlPr>
-          </m:sSubPr>
-          <m:e>
-            <m:acc>
-              <m:accPr>
-                <m:chr m:val="⃗"/>
-                <m:ctrlPr>
-                  <w:rPr>
-                    <w:rFonts w:ascii="Cambria Math" w:hAnsi="Cambria Math"/>
-                  </w:rPr>
-                </m:ctrlPr>
-              </m:accPr>
-              <m:e>
-                <m:r>
-                  <w:rPr>
-                    <w:rFonts w:ascii="Cambria Math" w:hAnsi="Cambria Math"/>
-                  </w:rPr>
-                  <m:t>v</m:t>
-                </m:r>
-              </m:e>
-            </m:acc>
-          </m:e>
-          <m:sub>
-            <m:r>
-              <m:rPr>
-                <m:sty m:val="p"/>
-              </m:rPr>
-              <w:rPr>
-                <w:rFonts w:ascii="Cambria Math" w:hAnsi="Cambria Math"/>
-              </w:rPr>
-              <m:t>⊥</m:t>
-            </m:r>
-          </m:sub>
-        </m:sSub>
-        <m:r>
-          <m:rPr>
-            <m:sty m:val="p"/>
-          </m:rPr>
-          <w:rPr>
-            <w:rFonts w:ascii="Cambria Math" w:hAnsi="Cambria Math"/>
-          </w:rPr>
-          <m:t>≠</m:t>
-        </m:r>
-        <m:r>
-          <w:rPr>
-            <w:rFonts w:ascii="Cambria Math" w:hAnsi="Cambria Math"/>
-          </w:rPr>
-          <m:t>0</m:t>
-        </m:r>
-      </m:oMath>
-      <w:r>
-        <w:t xml:space="preserve">), ensuring single-step friction vanishes </w:t>
-      </w:r>
-      <m:oMath>
-        <m:r>
-          <w:rPr>
-            <w:rFonts w:ascii="Cambria Math" w:hAnsi="Cambria Math"/>
-          </w:rPr>
-          <m:t>δ</m:t>
-        </m:r>
-        <m:sSubSup>
-          <m:sSubSupPr>
-            <m:ctrlPr>
-              <w:rPr>
-                <w:rFonts w:ascii="Cambria Math" w:hAnsi="Cambria Math"/>
-              </w:rPr>
-            </m:ctrlPr>
-          </m:sSubSupPr>
-          <m:e>
-            <m:r>
-              <w:rPr>
-                <w:rFonts w:ascii="Cambria Math" w:hAnsi="Cambria Math"/>
-              </w:rPr>
-              <m:t>W</m:t>
-            </m:r>
-          </m:e>
-          <m:sub>
-            <m:r>
-              <m:rPr>
-                <m:nor/>
-              </m:rPr>
-              <m:t>heat</m:t>
-            </m:r>
-          </m:sub>
-          <m:sup>
-            <m:r>
-              <m:rPr>
-                <m:sty m:val="p"/>
-              </m:rPr>
-              <w:rPr>
-                <w:rFonts w:ascii="Cambria Math" w:hAnsi="Cambria Math"/>
-              </w:rPr>
-              <m:t>(</m:t>
-            </m:r>
-            <m:r>
-              <w:rPr>
-                <w:rFonts w:ascii="Cambria Math" w:hAnsi="Cambria Math"/>
-              </w:rPr>
-              <m:t>k</m:t>
-            </m:r>
-            <m:r>
-              <m:rPr>
-                <m:sty m:val="p"/>
-              </m:rPr>
-              <w:rPr>
-                <w:rFonts w:ascii="Cambria Math" w:hAnsi="Cambria Math"/>
-              </w:rPr>
-              <m:t>)</m:t>
-            </m:r>
-          </m:sup>
-        </m:sSubSup>
-        <m:r>
-          <m:rPr>
-            <m:sty m:val="p"/>
-          </m:rPr>
-          <w:rPr>
-            <w:rFonts w:ascii="Cambria Math" w:hAnsi="Cambria Math"/>
-          </w:rPr>
-          <m:t>=</m:t>
-        </m:r>
-        <m:r>
-          <w:rPr>
-            <w:rFonts w:ascii="Cambria Math" w:hAnsi="Cambria Math"/>
-          </w:rPr>
-          <m:t>0</m:t>
-        </m:r>
-      </m:oMath>
-      <w:r>
-        <w:t>;</w:t>
-      </w:r>
-      <w:r>
-        <w:br/>
-      </w:r>
-    </w:p>
-    <w:p>
-      <w:pPr>
-        <w:pStyle w:val="Compact"/>
-        <w:numPr>
-          <w:ilvl w:val="0"/>
-          <w:numId w:val="4"/>
-        </w:numPr>
-      </w:pPr>
-      <w:r>
-        <w:rPr>
-          <w:b/>
-          <w:bCs/>
-        </w:rPr>
-        <w:t>Traversability Implies In-Boundary Optimality</w:t>
-      </w:r>
-      <w:r>
-        <w:t xml:space="preserve">: If the trajectory completes all </w:t>
-      </w:r>
-      <m:oMath>
-        <m:r>
-          <w:rPr>
-            <w:rFonts w:ascii="Cambria Math" w:hAnsi="Cambria Math"/>
-          </w:rPr>
-          <m:t>K</m:t>
-        </m:r>
-      </m:oMath>
-      <w:r>
-        <w:t xml:space="preserve"> steps under constraint </w:t>
-      </w:r>
-      <m:oMath>
-        <m:sSub>
-          <m:sSubPr>
-            <m:ctrlPr>
-              <w:rPr>
-                <w:rFonts w:ascii="Cambria Math" w:hAnsi="Cambria Math"/>
-              </w:rPr>
-            </m:ctrlPr>
-          </m:sSubPr>
-          <m:e>
-            <m:r>
-              <w:rPr>
-                <w:rFonts w:ascii="Cambria Math" w:hAnsi="Cambria Math"/>
-              </w:rPr>
-              <m:t>C</m:t>
-            </m:r>
-          </m:e>
-          <m:sub>
-            <m:r>
-              <w:rPr>
-                <w:rFonts w:ascii="Cambria Math" w:hAnsi="Cambria Math"/>
-              </w:rPr>
-              <m:t>k</m:t>
-            </m:r>
-          </m:sub>
-        </m:sSub>
-      </m:oMath>
-      <w:r>
-        <w:t>, cumulative friction is zero (</w:t>
-      </w:r>
-      <m:oMath>
-        <m:sSub>
-          <m:sSubPr>
-            <m:ctrlPr>
-              <w:rPr>
-                <w:rFonts w:ascii="Cambria Math" w:hAnsi="Cambria Math"/>
-              </w:rPr>
-            </m:ctrlPr>
-          </m:sSubPr>
-          <m:e>
-            <m:r>
-              <w:rPr>
-                <w:rFonts w:ascii="Cambria Math" w:hAnsi="Cambria Math"/>
-              </w:rPr>
-              <m:t>W</m:t>
-            </m:r>
-          </m:e>
-          <m:sub>
-            <m:r>
-              <m:rPr>
-                <m:nor/>
-              </m:rPr>
-              <m:t>heat</m:t>
-            </m:r>
-          </m:sub>
-        </m:sSub>
-        <m:r>
-          <m:rPr>
-            <m:sty m:val="p"/>
-          </m:rPr>
-          <w:rPr>
-            <w:rFonts w:ascii="Cambria Math" w:hAnsi="Cambria Math"/>
-          </w:rPr>
-          <m:t>[</m:t>
-        </m:r>
-        <m:sSubSup>
-          <m:sSubSupPr>
-            <m:ctrlPr>
-              <w:rPr>
-                <w:rFonts w:ascii="Cambria Math" w:hAnsi="Cambria Math"/>
-              </w:rPr>
-            </m:ctrlPr>
-          </m:sSubSupPr>
-          <m:e>
-            <m:r>
-              <w:rPr>
-                <w:rFonts w:ascii="Cambria Math" w:hAnsi="Cambria Math"/>
-              </w:rPr>
-              <m:t>S</m:t>
-            </m:r>
-          </m:e>
-          <m:sub>
-            <m:r>
-              <w:rPr>
-                <w:rFonts w:ascii="Cambria Math" w:hAnsi="Cambria Math"/>
-              </w:rPr>
-              <m:t>k</m:t>
-            </m:r>
-          </m:sub>
-          <m:sup>
-            <m:r>
-              <m:rPr>
-                <m:sty m:val="p"/>
-              </m:rPr>
-              <w:rPr>
-                <w:rFonts w:ascii="Cambria Math" w:hAnsi="Cambria Math"/>
-              </w:rPr>
-              <m:t>*</m:t>
-            </m:r>
-          </m:sup>
-        </m:sSubSup>
-        <m:r>
-          <m:rPr>
-            <m:sty m:val="p"/>
-          </m:rPr>
-          <w:rPr>
-            <w:rFonts w:ascii="Cambria Math" w:hAnsi="Cambria Math"/>
-          </w:rPr>
-          <m:t>]=</m:t>
-        </m:r>
-        <m:r>
-          <w:rPr>
-            <w:rFonts w:ascii="Cambria Math" w:hAnsi="Cambria Math"/>
-          </w:rPr>
-          <m:t>0</m:t>
-        </m:r>
-      </m:oMath>
-      <w:r>
-        <w:t>). Hitting physical lower bound zero makes the traversed path naturally and necessarily optimal in-boundary.</w:t>
-      </w:r>
-    </w:p>
-    <w:p>
-      <w:r>
-        <w:pict w14:anchorId="1001BA61">
-          <v:rect id="_x0000_i1028" style="width:0;height:1.5pt" o:hralign="center" o:hrstd="t" o:hr="t"/>
-        </w:pict>
-      </w:r>
-    </w:p>
-    <w:p>
-      <w:pPr>
-        <w:pStyle w:val="2"/>
-      </w:pPr>
-      <w:bookmarkStart w:id="8" w:name="X8865c8f59a761ec8df6580e89aa245b13be0598"/>
-      <w:bookmarkEnd w:id="7"/>
-      <w:bookmarkEnd w:id="5"/>
-      <w:r>
-        <w:t>3. Gödelian Incompleteness and Meta-Cognitive Dynamic Re-Bounding</w:t>
-      </w:r>
-    </w:p>
-    <w:p>
-      <w:pPr>
-        <w:pStyle w:val="Compact"/>
-        <w:numPr>
-          <w:ilvl w:val="0"/>
-          <w:numId w:val="5"/>
-        </w:numPr>
-      </w:pPr>
-      <w:r>
-        <w:rPr>
-          <w:b/>
-          <w:bCs/>
-        </w:rPr>
-        <w:t>Gödelian Residual</w:t>
-      </w:r>
-      <w:r>
-        <w:t xml:space="preserve">: Open complex giant systems continuously exchange matter, energy, and information with the environment. By Gödel’s Incompleteness Theorem, any finite boundary drawing </w:t>
-      </w:r>
-      <m:oMath>
-        <m:sSub>
-          <m:sSubPr>
-            <m:ctrlPr>
-              <w:rPr>
-                <w:rFonts w:ascii="Cambria Math" w:hAnsi="Cambria Math"/>
-              </w:rPr>
-            </m:ctrlPr>
-          </m:sSubPr>
-          <m:e>
-            <m:r>
-              <m:rPr>
-                <m:nor/>
-              </m:rPr>
-              <m:t>Boundary</m:t>
-            </m:r>
-          </m:e>
-          <m:sub>
-            <m:r>
-              <w:rPr>
-                <w:rFonts w:ascii="Cambria Math" w:hAnsi="Cambria Math"/>
-              </w:rPr>
-              <m:t>k</m:t>
-            </m:r>
-          </m:sub>
-        </m:sSub>
-      </m:oMath>
-      <w:r>
-        <w:t xml:space="preserve"> cannot envelope external continuous perturbations, inevitably manifesting cotangent residuals exceeding internal computation: </w:t>
-      </w:r>
-      <m:oMath>
-        <m:r>
-          <m:rPr>
-            <m:sty m:val="p"/>
-          </m:rPr>
-          <w:rPr>
-            <w:rFonts w:ascii="Cambria Math" w:hAnsi="Cambria Math"/>
-          </w:rPr>
-          <m:t>∥Δ</m:t>
-        </m:r>
-        <m:r>
-          <w:rPr>
-            <w:rFonts w:ascii="Cambria Math" w:hAnsi="Cambria Math"/>
-          </w:rPr>
-          <m:t>X</m:t>
-        </m:r>
-        <m:r>
-          <m:rPr>
-            <m:sty m:val="p"/>
-          </m:rPr>
-          <w:rPr>
-            <w:rFonts w:ascii="Cambria Math" w:hAnsi="Cambria Math"/>
-          </w:rPr>
-          <m:t>(</m:t>
-        </m:r>
-        <m:r>
-          <w:rPr>
-            <w:rFonts w:ascii="Cambria Math" w:hAnsi="Cambria Math"/>
-          </w:rPr>
-          <m:t>t</m:t>
-        </m:r>
-        <m:r>
-          <m:rPr>
-            <m:sty m:val="p"/>
-          </m:rPr>
-          <w:rPr>
-            <w:rFonts w:ascii="Cambria Math" w:hAnsi="Cambria Math"/>
-          </w:rPr>
-          <m:t>)∥&gt;</m:t>
-        </m:r>
-        <m:r>
-          <w:rPr>
-            <w:rFonts w:ascii="Cambria Math" w:hAnsi="Cambria Math"/>
-          </w:rPr>
-          <m:t>θ</m:t>
-        </m:r>
-      </m:oMath>
-      <w:r>
-        <w:t>.</w:t>
-      </w:r>
-    </w:p>
-    <w:p>
-      <w:pPr>
-        <w:pStyle w:val="Compact"/>
-        <w:numPr>
-          <w:ilvl w:val="0"/>
-          <w:numId w:val="5"/>
-        </w:numPr>
-      </w:pPr>
-      <w:r>
-        <w:rPr>
-          <w:b/>
-          <w:bCs/>
-        </w:rPr>
         <w:t xml:space="preserve">Meta-Cognitive Amendment Operator </w:t>
       </w:r>
       <m:oMath>
@@ -4302,7 +4257,7 @@
         <w:pStyle w:val="Compact"/>
         <w:numPr>
           <w:ilvl w:val="1"/>
-          <w:numId w:val="6"/>
+          <w:numId w:val="7"/>
         </w:numPr>
       </w:pPr>
       <w:r>
@@ -4347,7 +4302,7 @@
         <w:pStyle w:val="Compact"/>
         <w:numPr>
           <w:ilvl w:val="1"/>
-          <w:numId w:val="6"/>
+          <w:numId w:val="7"/>
         </w:numPr>
       </w:pPr>
       <w:r>
@@ -4392,11 +4347,10 @@
         <w:pStyle w:val="Compact"/>
         <w:numPr>
           <w:ilvl w:val="1"/>
-          <w:numId w:val="6"/>
+          <w:numId w:val="7"/>
         </w:numPr>
       </w:pPr>
       <w:r>
-        <w:lastRenderedPageBreak/>
         <w:t xml:space="preserve">Absorbing new residuals into constraint set </w:t>
       </w:r>
       <m:oMath>
@@ -4482,24 +4436,15 @@
             </m:ctrlPr>
           </m:sSubPr>
           <m:e>
-            <m:acc>
-              <m:accPr>
-                <m:chr m:val="⃗"/>
-                <m:ctrlPr>
-                  <w:rPr>
-                    <w:rFonts w:ascii="Cambria Math" w:hAnsi="Cambria Math"/>
-                  </w:rPr>
-                </m:ctrlPr>
-              </m:accPr>
-              <m:e>
-                <m:r>
-                  <w:rPr>
-                    <w:rFonts w:ascii="Cambria Math" w:hAnsi="Cambria Math"/>
-                  </w:rPr>
-                  <m:t>v</m:t>
-                </m:r>
-              </m:e>
-            </m:acc>
+            <m:r>
+              <m:rPr>
+                <m:sty m:val="bi"/>
+              </m:rPr>
+              <w:rPr>
+                <w:rFonts w:ascii="Cambria Math" w:hAnsi="Cambria Math"/>
+              </w:rPr>
+              <m:t>v</m:t>
+            </m:r>
           </m:e>
           <m:sub>
             <m:r>
@@ -4528,24 +4473,15 @@
             </m:ctrlPr>
           </m:sSubPr>
           <m:e>
-            <m:acc>
-              <m:accPr>
-                <m:chr m:val="⃗"/>
-                <m:ctrlPr>
-                  <w:rPr>
-                    <w:rFonts w:ascii="Cambria Math" w:hAnsi="Cambria Math"/>
-                  </w:rPr>
-                </m:ctrlPr>
-              </m:accPr>
-              <m:e>
-                <m:r>
-                  <w:rPr>
-                    <w:rFonts w:ascii="Cambria Math" w:hAnsi="Cambria Math"/>
-                  </w:rPr>
-                  <m:t>v</m:t>
-                </m:r>
-              </m:e>
-            </m:acc>
+            <m:r>
+              <m:rPr>
+                <m:sty m:val="bi"/>
+              </m:rPr>
+              <w:rPr>
+                <w:rFonts w:ascii="Cambria Math" w:hAnsi="Cambria Math"/>
+              </w:rPr>
+              <m:t>v</m:t>
+            </m:r>
           </m:e>
           <m:sub>
             <m:r>
@@ -4617,7 +4553,7 @@
     </w:p>
     <w:p>
       <w:r>
-        <w:pict w14:anchorId="2D57E2F2">
+        <w:pict>
           <v:rect id="_x0000_i1029" style="width:0;height:1.5pt" o:hralign="center" o:hrstd="t" o:hr="t"/>
         </w:pict>
       </w:r>
@@ -4768,24 +4704,15 @@
                   </m:ctrlPr>
                 </m:sSubPr>
                 <m:e>
-                  <m:acc>
-                    <m:accPr>
-                      <m:chr m:val="⃗"/>
-                      <m:ctrlPr>
-                        <w:rPr>
-                          <w:rFonts w:ascii="Cambria Math" w:hAnsi="Cambria Math"/>
-                        </w:rPr>
-                      </m:ctrlPr>
-                    </m:accPr>
-                    <m:e>
-                      <m:r>
-                        <w:rPr>
-                          <w:rFonts w:ascii="Cambria Math" w:hAnsi="Cambria Math"/>
-                        </w:rPr>
-                        <m:t>v</m:t>
-                      </m:r>
-                    </m:e>
-                  </m:acc>
+                  <m:r>
+                    <m:rPr>
+                      <m:sty m:val="bi"/>
+                    </m:rPr>
+                    <w:rPr>
+                      <w:rFonts w:ascii="Cambria Math" w:hAnsi="Cambria Math"/>
+                    </w:rPr>
+                    <m:t>v</m:t>
+                  </m:r>
                 </m:e>
                 <m:sub>
                   <m:r>
@@ -4814,24 +4741,15 @@
                   </m:ctrlPr>
                 </m:sSubPr>
                 <m:e>
-                  <m:acc>
-                    <m:accPr>
-                      <m:chr m:val="⃗"/>
-                      <m:ctrlPr>
-                        <w:rPr>
-                          <w:rFonts w:ascii="Cambria Math" w:hAnsi="Cambria Math"/>
-                        </w:rPr>
-                      </m:ctrlPr>
-                    </m:accPr>
-                    <m:e>
-                      <m:r>
-                        <w:rPr>
-                          <w:rFonts w:ascii="Cambria Math" w:hAnsi="Cambria Math"/>
-                        </w:rPr>
-                        <m:t>v</m:t>
-                      </m:r>
-                    </m:e>
-                  </m:acc>
+                  <m:r>
+                    <m:rPr>
+                      <m:sty m:val="bi"/>
+                    </m:rPr>
+                    <w:rPr>
+                      <w:rFonts w:ascii="Cambria Math" w:hAnsi="Cambria Math"/>
+                    </w:rPr>
+                    <m:t>v</m:t>
+                  </m:r>
                 </m:e>
                 <m:sub>
                   <m:r>
@@ -5046,6 +4964,21 @@
       <w:pPr>
         <w:pStyle w:val="a0"/>
       </w:pPr>
+      <w:r>
+        <w:rPr>
+          <w:b/>
+          <w:bCs/>
+        </w:rPr>
+        <w:t>Living Governance Three-State Loop:</w:t>
+      </w:r>
+      <w:r>
+        <w:br/>
+      </w:r>
+    </w:p>
+    <w:p>
+      <w:pPr>
+        <w:pStyle w:val="a0"/>
+      </w:pPr>
       <m:oMathPara>
         <m:oMathParaPr>
           <m:jc m:val="center"/>
@@ -5055,11 +4988,11 @@
             <m:rPr>
               <m:nor/>
             </m:rPr>
-            <m:t>Living Governance Three-State Loop: Generation (Boundary Est.)</m:t>
+            <m:t>Generation (Boundary Est.)</m:t>
           </m:r>
           <m:r>
             <m:rPr>
-              <m:sty m:val="b"/>
+              <m:sty m:val="p"/>
             </m:rPr>
             <w:rPr>
               <w:rFonts w:ascii="Cambria Math" w:hAnsi="Cambria Math"/>
@@ -5074,7 +5007,7 @@
           </m:r>
           <m:r>
             <m:rPr>
-              <m:sty m:val="b"/>
+              <m:sty m:val="p"/>
             </m:rPr>
             <w:rPr>
               <w:rFonts w:ascii="Cambria Math" w:hAnsi="Cambria Math"/>
@@ -5092,7 +5025,7 @@
     </w:p>
     <w:p>
       <w:r>
-        <w:pict w14:anchorId="1FAA313D">
+        <w:pict>
           <v:rect id="_x0000_i1030" style="width:0;height:1.5pt" o:hralign="center" o:hrstd="t" o:hr="t"/>
         </w:pict>
       </w:r>
@@ -5104,6 +5037,7 @@
       <w:bookmarkStart w:id="10" w:name="popperian-falsifiability-matrix"/>
       <w:bookmarkEnd w:id="9"/>
       <w:r>
+        <w:lastRenderedPageBreak/>
         <w:t>5. Popperian Falsifiability Matrix</w:t>
       </w:r>
     </w:p>
@@ -5186,15 +5120,7 @@
                 <w:b/>
                 <w:bCs/>
               </w:rPr>
-              <w:t xml:space="preserve">Theorem 1.1 (5D </w:t>
-            </w:r>
-            <w:r>
-              <w:rPr>
-                <w:b/>
-                <w:bCs/>
-              </w:rPr>
-              <w:lastRenderedPageBreak/>
-              <w:t>Manifold Completeness)</w:t>
+              <w:t>Theorem 1.1 (5D Manifold Completeness)</w:t>
             </w:r>
           </w:p>
         </w:tc>
@@ -5207,12 +5133,7 @@
               <w:pStyle w:val="Compact"/>
             </w:pPr>
             <w:r>
-              <w:lastRenderedPageBreak/>
-              <w:t xml:space="preserve">Phase space measure &amp; </w:t>
-            </w:r>
-            <w:r>
-              <w:lastRenderedPageBreak/>
-              <w:t>topological basis</w:t>
+              <w:t>Phase space measure &amp; topological basis</w:t>
             </w:r>
           </w:p>
         </w:tc>
@@ -5225,12 +5146,7 @@
               <w:pStyle w:val="Compact"/>
             </w:pPr>
             <w:r>
-              <w:lastRenderedPageBreak/>
-              <w:t xml:space="preserve">Discovery of any state </w:t>
-            </w:r>
-            <w:r>
-              <w:lastRenderedPageBreak/>
-              <w:t>transition unrepresentable by 5D; or proof that 1 dimension is linearly expressible by the other four.</w:t>
+              <w:t>Discovery of any state transition unrepresentable by 5D; or proof that 1 dimension is linearly expressible by the other four.</w:t>
             </w:r>
           </w:p>
         </w:tc>
@@ -5249,7 +5165,6 @@
                 <w:b/>
                 <w:bCs/>
               </w:rPr>
-              <w:lastRenderedPageBreak/>
               <w:t>Theorem 2.1 (Closed-Loop Computability)</w:t>
             </w:r>
           </w:p>
@@ -5576,7 +5491,7 @@
     </w:tbl>
     <w:p>
       <w:r>
-        <w:pict w14:anchorId="5F2FA409">
+        <w:pict>
           <v:rect id="_x0000_i1031" style="width:0;height:1.5pt" o:hralign="center" o:hrstd="t" o:hr="t"/>
         </w:pict>
       </w:r>
@@ -5596,7 +5511,7 @@
         <w:pStyle w:val="Compact"/>
         <w:numPr>
           <w:ilvl w:val="0"/>
-          <w:numId w:val="7"/>
+          <w:numId w:val="8"/>
         </w:numPr>
       </w:pPr>
       <w:r>
@@ -5693,7 +5608,7 @@
         <w:pStyle w:val="Compact"/>
         <w:numPr>
           <w:ilvl w:val="0"/>
-          <w:numId w:val="7"/>
+          <w:numId w:val="8"/>
         </w:numPr>
       </w:pPr>
       <w:r>
@@ -5701,6 +5616,7 @@
           <w:b/>
           <w:bCs/>
         </w:rPr>
+        <w:lastRenderedPageBreak/>
         <w:t>Self-Consistent Computability Law</w:t>
       </w:r>
       <w:r>
@@ -5725,24 +5641,15 @@
             </m:ctrlPr>
           </m:sSubPr>
           <m:e>
-            <m:acc>
-              <m:accPr>
-                <m:chr m:val="⃗"/>
-                <m:ctrlPr>
-                  <w:rPr>
-                    <w:rFonts w:ascii="Cambria Math" w:hAnsi="Cambria Math"/>
-                  </w:rPr>
-                </m:ctrlPr>
-              </m:accPr>
-              <m:e>
-                <m:r>
-                  <w:rPr>
-                    <w:rFonts w:ascii="Cambria Math" w:hAnsi="Cambria Math"/>
-                  </w:rPr>
-                  <m:t>v</m:t>
-                </m:r>
-              </m:e>
-            </m:acc>
+            <m:r>
+              <m:rPr>
+                <m:sty m:val="bi"/>
+              </m:rPr>
+              <w:rPr>
+                <w:rFonts w:ascii="Cambria Math" w:hAnsi="Cambria Math"/>
+              </w:rPr>
+              <m:t>v</m:t>
+            </m:r>
           </m:e>
           <m:sub>
             <m:r>
@@ -5771,24 +5678,15 @@
             </m:ctrlPr>
           </m:sSubPr>
           <m:e>
-            <m:acc>
-              <m:accPr>
-                <m:chr m:val="⃗"/>
-                <m:ctrlPr>
-                  <w:rPr>
-                    <w:rFonts w:ascii="Cambria Math" w:hAnsi="Cambria Math"/>
-                  </w:rPr>
-                </m:ctrlPr>
-              </m:accPr>
-              <m:e>
-                <m:r>
-                  <w:rPr>
-                    <w:rFonts w:ascii="Cambria Math" w:hAnsi="Cambria Math"/>
-                  </w:rPr>
-                  <m:t>v</m:t>
-                </m:r>
-              </m:e>
-            </m:acc>
+            <m:r>
+              <m:rPr>
+                <m:sty m:val="bi"/>
+              </m:rPr>
+              <w:rPr>
+                <w:rFonts w:ascii="Cambria Math" w:hAnsi="Cambria Math"/>
+              </w:rPr>
+              <m:t>v</m:t>
+            </m:r>
           </m:e>
           <m:sub>
             <m:r>
@@ -5853,7 +5751,7 @@
         <w:pStyle w:val="Compact"/>
         <w:numPr>
           <w:ilvl w:val="0"/>
-          <w:numId w:val="7"/>
+          <w:numId w:val="8"/>
         </w:numPr>
       </w:pPr>
       <w:r>
@@ -6000,7 +5898,7 @@
         <w:pStyle w:val="Compact"/>
         <w:numPr>
           <w:ilvl w:val="0"/>
-          <w:numId w:val="7"/>
+          <w:numId w:val="8"/>
         </w:numPr>
       </w:pPr>
       <w:r>
@@ -6008,7 +5906,6 @@
           <w:b/>
           <w:bCs/>
         </w:rPr>
-        <w:lastRenderedPageBreak/>
         <w:t>Axiomatic Inheritance Across Domains</w:t>
       </w:r>
       <w:r>
@@ -6253,7 +6150,7 @@
     </w:p>
     <w:p>
       <w:r>
-        <w:pict w14:anchorId="41B4D3EC">
+        <w:pict>
           <v:rect id="_x0000_i1032" style="width:0;height:1.5pt" o:hralign="center" o:hrstd="t" o:hr="t"/>
         </w:pict>
       </w:r>
@@ -6273,7 +6170,7 @@
         <w:pStyle w:val="Compact"/>
         <w:numPr>
           <w:ilvl w:val="0"/>
-          <w:numId w:val="8"/>
+          <w:numId w:val="9"/>
         </w:numPr>
       </w:pPr>
       <w:r>
@@ -6295,7 +6192,7 @@
         <w:pStyle w:val="Compact"/>
         <w:numPr>
           <w:ilvl w:val="0"/>
-          <w:numId w:val="8"/>
+          <w:numId w:val="9"/>
         </w:numPr>
       </w:pPr>
       <w:r>
@@ -6307,7 +6204,7 @@
         <w:pStyle w:val="Compact"/>
         <w:numPr>
           <w:ilvl w:val="0"/>
-          <w:numId w:val="8"/>
+          <w:numId w:val="9"/>
         </w:numPr>
       </w:pPr>
       <w:r>
@@ -6329,7 +6226,7 @@
         <w:pStyle w:val="Compact"/>
         <w:numPr>
           <w:ilvl w:val="0"/>
-          <w:numId w:val="8"/>
+          <w:numId w:val="9"/>
         </w:numPr>
       </w:pPr>
       <w:r>
@@ -6351,7 +6248,7 @@
         <w:pStyle w:val="Compact"/>
         <w:numPr>
           <w:ilvl w:val="0"/>
-          <w:numId w:val="8"/>
+          <w:numId w:val="9"/>
         </w:numPr>
       </w:pPr>
       <w:r>
@@ -6373,7 +6270,7 @@
         <w:pStyle w:val="Compact"/>
         <w:numPr>
           <w:ilvl w:val="0"/>
-          <w:numId w:val="8"/>
+          <w:numId w:val="9"/>
         </w:numPr>
       </w:pPr>
       <w:r>
@@ -6385,7 +6282,7 @@
         <w:pStyle w:val="Compact"/>
         <w:numPr>
           <w:ilvl w:val="0"/>
-          <w:numId w:val="8"/>
+          <w:numId w:val="9"/>
         </w:numPr>
       </w:pPr>
       <w:r>
@@ -6407,7 +6304,7 @@
         <w:pStyle w:val="Compact"/>
         <w:numPr>
           <w:ilvl w:val="0"/>
-          <w:numId w:val="8"/>
+          <w:numId w:val="9"/>
         </w:numPr>
       </w:pPr>
       <w:r>
@@ -6419,7 +6316,7 @@
         <w:pStyle w:val="Compact"/>
         <w:numPr>
           <w:ilvl w:val="0"/>
-          <w:numId w:val="8"/>
+          <w:numId w:val="9"/>
         </w:numPr>
       </w:pPr>
       <w:r>
@@ -6431,7 +6328,7 @@
         <w:pStyle w:val="Compact"/>
         <w:numPr>
           <w:ilvl w:val="0"/>
-          <w:numId w:val="8"/>
+          <w:numId w:val="9"/>
         </w:numPr>
       </w:pPr>
       <w:r>
@@ -6641,7 +6538,7 @@
   <w:abstractNum w:abstractNumId="0" w15:restartNumberingAfterBreak="0">
     <w:nsid w:val="0000A990"/>
     <w:multiLevelType w:val="multilevel"/>
-    <w:tmpl w:val="F6D25800"/>
+    <w:tmpl w:val="41A81F60"/>
     <w:lvl w:ilvl="0">
       <w:numFmt w:val="bullet"/>
       <w:lvlText w:val=" "/>
@@ -6718,7 +6615,7 @@
   <w:abstractNum w:abstractNumId="1" w15:restartNumberingAfterBreak="0">
     <w:nsid w:val="0000A991"/>
     <w:multiLevelType w:val="multilevel"/>
-    <w:tmpl w:val="C3C8512A"/>
+    <w:tmpl w:val="4BD6BA7C"/>
     <w:lvl w:ilvl="0">
       <w:numFmt w:val="bullet"/>
       <w:lvlText w:val=""/>
@@ -6822,7 +6719,7 @@
   <w:abstractNum w:abstractNumId="2" w15:restartNumberingAfterBreak="0">
     <w:nsid w:val="00A99411"/>
     <w:multiLevelType w:val="multilevel"/>
-    <w:tmpl w:val="97FC3DC0"/>
+    <w:tmpl w:val="4C82677E"/>
     <w:lvl w:ilvl="0">
       <w:start w:val="1"/>
       <w:numFmt w:val="decimal"/>
@@ -6905,16 +6802,16 @@
       </w:pPr>
     </w:lvl>
   </w:abstractNum>
-  <w:num w:numId="1" w16cid:durableId="659425154">
+  <w:num w:numId="1" w16cid:durableId="638848632">
     <w:abstractNumId w:val="0"/>
   </w:num>
-  <w:num w:numId="2" w16cid:durableId="1856310553">
+  <w:num w:numId="2" w16cid:durableId="1448937223">
     <w:abstractNumId w:val="1"/>
   </w:num>
-  <w:num w:numId="3" w16cid:durableId="1101991218">
+  <w:num w:numId="3" w16cid:durableId="1651861347">
     <w:abstractNumId w:val="1"/>
   </w:num>
-  <w:num w:numId="4" w16cid:durableId="637295699">
+  <w:num w:numId="4" w16cid:durableId="1434548574">
     <w:abstractNumId w:val="2"/>
     <w:lvlOverride w:ilvl="0">
       <w:startOverride w:val="1"/>
@@ -6944,10 +6841,7 @@
       <w:startOverride w:val="1"/>
     </w:lvlOverride>
   </w:num>
-  <w:num w:numId="5" w16cid:durableId="1732926376">
-    <w:abstractNumId w:val="1"/>
-  </w:num>
-  <w:num w:numId="6" w16cid:durableId="2036037303">
+  <w:num w:numId="5" w16cid:durableId="2103604895">
     <w:abstractNumId w:val="2"/>
     <w:lvlOverride w:ilvl="0">
       <w:startOverride w:val="1"/>
@@ -6977,7 +6871,10 @@
       <w:startOverride w:val="1"/>
     </w:lvlOverride>
   </w:num>
-  <w:num w:numId="7" w16cid:durableId="663708698">
+  <w:num w:numId="6" w16cid:durableId="1264611100">
+    <w:abstractNumId w:val="1"/>
+  </w:num>
+  <w:num w:numId="7" w16cid:durableId="2028825606">
     <w:abstractNumId w:val="2"/>
     <w:lvlOverride w:ilvl="0">
       <w:startOverride w:val="1"/>
@@ -7007,7 +6904,37 @@
       <w:startOverride w:val="1"/>
     </w:lvlOverride>
   </w:num>
-  <w:num w:numId="8" w16cid:durableId="870604017">
+  <w:num w:numId="8" w16cid:durableId="2058580776">
+    <w:abstractNumId w:val="2"/>
+    <w:lvlOverride w:ilvl="0">
+      <w:startOverride w:val="1"/>
+    </w:lvlOverride>
+    <w:lvlOverride w:ilvl="1">
+      <w:startOverride w:val="1"/>
+    </w:lvlOverride>
+    <w:lvlOverride w:ilvl="2">
+      <w:startOverride w:val="1"/>
+    </w:lvlOverride>
+    <w:lvlOverride w:ilvl="3">
+      <w:startOverride w:val="1"/>
+    </w:lvlOverride>
+    <w:lvlOverride w:ilvl="4">
+      <w:startOverride w:val="1"/>
+    </w:lvlOverride>
+    <w:lvlOverride w:ilvl="5">
+      <w:startOverride w:val="1"/>
+    </w:lvlOverride>
+    <w:lvlOverride w:ilvl="6">
+      <w:startOverride w:val="1"/>
+    </w:lvlOverride>
+    <w:lvlOverride w:ilvl="7">
+      <w:startOverride w:val="1"/>
+    </w:lvlOverride>
+    <w:lvlOverride w:ilvl="8">
+      <w:startOverride w:val="1"/>
+    </w:lvlOverride>
+  </w:num>
+  <w:num w:numId="9" w16cid:durableId="774977244">
     <w:abstractNumId w:val="2"/>
     <w:lvlOverride w:ilvl="0">
       <w:startOverride w:val="1"/>
@@ -8270,7 +8197,7 @@
     <w:name w:val="header"/>
     <w:basedOn w:val="a"/>
     <w:link w:val="af1"/>
-    <w:rsid w:val="00DE3BD9"/>
+    <w:rsid w:val="008029A5"/>
     <w:pPr>
       <w:tabs>
         <w:tab w:val="center" w:pos="4153"/>
@@ -8288,7 +8215,7 @@
     <w:name w:val="页眉 字符"/>
     <w:basedOn w:val="a1"/>
     <w:link w:val="af0"/>
-    <w:rsid w:val="00DE3BD9"/>
+    <w:rsid w:val="008029A5"/>
     <w:rPr>
       <w:sz w:val="18"/>
       <w:szCs w:val="18"/>
@@ -8298,7 +8225,7 @@
     <w:name w:val="footer"/>
     <w:basedOn w:val="a"/>
     <w:link w:val="af3"/>
-    <w:rsid w:val="00DE3BD9"/>
+    <w:rsid w:val="008029A5"/>
     <w:pPr>
       <w:tabs>
         <w:tab w:val="center" w:pos="4153"/>
@@ -8315,7 +8242,7 @@
     <w:name w:val="页脚 字符"/>
     <w:basedOn w:val="a1"/>
     <w:link w:val="af2"/>
-    <w:rsid w:val="00DE3BD9"/>
+    <w:rsid w:val="008029A5"/>
     <w:rPr>
       <w:sz w:val="18"/>
       <w:szCs w:val="18"/>
@@ -8324,7 +8251,7 @@
   <w:style w:type="character" w:styleId="af4">
     <w:name w:val="page number"/>
     <w:basedOn w:val="a1"/>
-    <w:rsid w:val="00DE3BD9"/>
+    <w:rsid w:val="008029A5"/>
   </w:style>
 </w:styles>
 </file>

</xml_diff>